<commit_message>
Ez a dokumentáció frissítve.
</commit_message>
<xml_diff>
--- a/felhasználói dokumentum.docx
+++ b/felhasználói dokumentum.docx
@@ -61,6 +61,7 @@
     <w:p>
       <w:pPr>
         <w:spacing w:before="100" w:beforeAutospacing="1" w:after="100" w:afterAutospacing="1" w:line="240" w:lineRule="auto"/>
+        <w:ind w:firstLine="708"/>
         <w:jc w:val="center"/>
         <w:outlineLvl w:val="0"/>
         <w:rPr>
@@ -556,60 +557,1149 @@
         <w:spacing w:before="100" w:beforeAutospacing="1" w:after="100" w:afterAutospacing="1" w:line="240" w:lineRule="auto"/>
         <w:rPr>
           <w:rFonts w:ascii="Times New Roman" w:eastAsia="Times New Roman" w:hAnsi="Times New Roman" w:cs="Times New Roman"/>
+          <w:sz w:val="32"/>
+          <w:szCs w:val="32"/>
+          <w:lang w:eastAsia="hu-HU"/>
+        </w:rPr>
+      </w:pPr>
+      <w:r>
+        <w:rPr>
+          <w:rFonts w:ascii="Times New Roman" w:eastAsia="Times New Roman" w:hAnsi="Times New Roman" w:cs="Times New Roman"/>
+          <w:sz w:val="32"/>
+          <w:szCs w:val="32"/>
+          <w:lang w:eastAsia="hu-HU"/>
+        </w:rPr>
+        <w:t xml:space="preserve">A </w:t>
+      </w:r>
+      <w:proofErr w:type="spellStart"/>
+      <w:r>
+        <w:rPr>
+          <w:rFonts w:ascii="Times New Roman" w:eastAsia="Times New Roman" w:hAnsi="Times New Roman" w:cs="Times New Roman"/>
+          <w:sz w:val="32"/>
+          <w:szCs w:val="32"/>
+          <w:lang w:eastAsia="hu-HU"/>
+        </w:rPr>
+        <w:t>zenelejátszó</w:t>
+      </w:r>
+      <w:proofErr w:type="spellEnd"/>
+      <w:r>
+        <w:rPr>
+          <w:rFonts w:ascii="Times New Roman" w:eastAsia="Times New Roman" w:hAnsi="Times New Roman" w:cs="Times New Roman"/>
+          <w:sz w:val="32"/>
+          <w:szCs w:val="32"/>
+          <w:lang w:eastAsia="hu-HU"/>
+        </w:rPr>
+        <w:t xml:space="preserve"> </w:t>
+      </w:r>
+      <w:r>
+        <w:rPr>
+          <w:rFonts w:ascii="Times New Roman" w:eastAsia="Times New Roman" w:hAnsi="Times New Roman" w:cs="Times New Roman"/>
+          <w:sz w:val="32"/>
+          <w:szCs w:val="32"/>
+          <w:lang w:eastAsia="hu-HU"/>
+        </w:rPr>
+        <w:t>alkalmazás</w:t>
+      </w:r>
+      <w:r>
+        <w:rPr>
+          <w:rFonts w:ascii="Times New Roman" w:eastAsia="Times New Roman" w:hAnsi="Times New Roman" w:cs="Times New Roman"/>
+          <w:sz w:val="32"/>
+          <w:szCs w:val="32"/>
+          <w:lang w:eastAsia="hu-HU"/>
+        </w:rPr>
+        <w:t xml:space="preserve"> elérhető mobiltelefonról és minden olyan eszközről, amely rendelkezik internetkapcsolattal.</w:t>
+      </w:r>
+    </w:p>
+    <w:p>
+      <w:pPr>
+        <w:spacing w:before="100" w:beforeAutospacing="1" w:after="100" w:afterAutospacing="1" w:line="240" w:lineRule="auto"/>
+        <w:outlineLvl w:val="1"/>
+        <w:rPr>
+          <w:rFonts w:ascii="Times New Roman" w:eastAsia="Times New Roman" w:hAnsi="Times New Roman" w:cs="Times New Roman"/>
+          <w:b/>
+          <w:bCs/>
+          <w:color w:val="5B9BD5" w:themeColor="accent5"/>
+          <w:sz w:val="40"/>
+          <w:szCs w:val="40"/>
+          <w:u w:val="single"/>
+          <w:lang w:eastAsia="hu-HU"/>
+        </w:rPr>
+      </w:pPr>
+      <w:r>
+        <w:rPr>
+          <w:rFonts w:ascii="Times New Roman" w:eastAsia="Times New Roman" w:hAnsi="Times New Roman" w:cs="Times New Roman"/>
+          <w:b/>
+          <w:bCs/>
+          <w:color w:val="5B9BD5" w:themeColor="accent5"/>
+          <w:sz w:val="40"/>
+          <w:szCs w:val="40"/>
+          <w:u w:val="single"/>
+          <w:lang w:eastAsia="hu-HU"/>
+        </w:rPr>
+        <w:lastRenderedPageBreak/>
+        <w:t>Használati útmutató</w:t>
+      </w:r>
+    </w:p>
+    <w:p>
+      <w:pPr>
+        <w:spacing w:before="100" w:beforeAutospacing="1" w:after="100" w:afterAutospacing="1" w:line="240" w:lineRule="auto"/>
+        <w:outlineLvl w:val="1"/>
+        <w:rPr>
+          <w:rFonts w:ascii="Times New Roman" w:eastAsia="Times New Roman" w:hAnsi="Times New Roman" w:cs="Times New Roman"/>
+          <w:b/>
+          <w:bCs/>
+          <w:color w:val="5B9BD5" w:themeColor="accent5"/>
+          <w:sz w:val="40"/>
+          <w:szCs w:val="40"/>
+          <w:u w:val="single"/>
+          <w:lang w:eastAsia="hu-HU"/>
+        </w:rPr>
+      </w:pPr>
+    </w:p>
+    <w:p>
+      <w:pPr>
+        <w:spacing w:before="100" w:beforeAutospacing="1" w:after="100" w:afterAutospacing="1" w:line="240" w:lineRule="auto"/>
+        <w:outlineLvl w:val="1"/>
+        <w:rPr>
+          <w:rFonts w:ascii="Times New Roman" w:hAnsi="Times New Roman" w:cs="Times New Roman"/>
+          <w:sz w:val="32"/>
+          <w:szCs w:val="32"/>
+        </w:rPr>
+      </w:pPr>
+      <w:r>
+        <w:rPr>
+          <w:rFonts w:ascii="Times New Roman" w:hAnsi="Times New Roman" w:cs="Times New Roman"/>
+          <w:sz w:val="32"/>
+          <w:szCs w:val="32"/>
+        </w:rPr>
+        <w:t xml:space="preserve">A program használata rendkívül egyszerű, és a kezelőfelület kialakítása felhasználóbarát. Az alábbi lépéseket követve kezdheted el a </w:t>
+      </w:r>
+      <w:r>
+        <w:rPr>
+          <w:rFonts w:ascii="Times New Roman" w:hAnsi="Times New Roman" w:cs="Times New Roman"/>
+          <w:b/>
+          <w:sz w:val="32"/>
+          <w:szCs w:val="32"/>
+          <w:u w:val="single"/>
+        </w:rPr>
+        <w:t>MELO</w:t>
+      </w:r>
+      <w:r>
+        <w:rPr>
+          <w:rFonts w:ascii="Times New Roman" w:hAnsi="Times New Roman" w:cs="Times New Roman"/>
+          <w:b/>
+          <w:sz w:val="32"/>
+          <w:szCs w:val="32"/>
+          <w:u w:val="single"/>
+        </w:rPr>
+        <w:t>D</w:t>
+      </w:r>
+      <w:r>
+        <w:rPr>
+          <w:rFonts w:ascii="Times New Roman" w:hAnsi="Times New Roman" w:cs="Times New Roman"/>
+          <w:b/>
+          <w:sz w:val="32"/>
+          <w:szCs w:val="32"/>
+          <w:u w:val="single"/>
+        </w:rPr>
+        <w:t>YFLOW</w:t>
+      </w:r>
+      <w:r>
+        <w:rPr>
+          <w:rFonts w:ascii="Times New Roman" w:hAnsi="Times New Roman" w:cs="Times New Roman"/>
+          <w:sz w:val="32"/>
+          <w:szCs w:val="32"/>
+        </w:rPr>
+        <w:t xml:space="preserve"> </w:t>
+      </w:r>
+      <w:proofErr w:type="spellStart"/>
+      <w:r>
+        <w:rPr>
+          <w:rFonts w:ascii="Times New Roman" w:hAnsi="Times New Roman" w:cs="Times New Roman"/>
+          <w:sz w:val="32"/>
+          <w:szCs w:val="32"/>
+        </w:rPr>
+        <w:t>Zenelejátszó</w:t>
+      </w:r>
+      <w:proofErr w:type="spellEnd"/>
+      <w:r>
+        <w:rPr>
+          <w:rFonts w:ascii="Times New Roman" w:hAnsi="Times New Roman" w:cs="Times New Roman"/>
+          <w:sz w:val="32"/>
+          <w:szCs w:val="32"/>
+        </w:rPr>
+        <w:t xml:space="preserve"> alkalmazás használatát:</w:t>
+      </w:r>
+    </w:p>
+    <w:p>
+      <w:pPr>
+        <w:spacing w:before="100" w:beforeAutospacing="1" w:after="100" w:afterAutospacing="1" w:line="240" w:lineRule="auto"/>
+        <w:outlineLvl w:val="1"/>
+        <w:rPr>
+          <w:rFonts w:ascii="Times New Roman" w:eastAsia="Times New Roman" w:hAnsi="Times New Roman" w:cs="Times New Roman"/>
+          <w:b/>
+          <w:bCs/>
+          <w:color w:val="5B9BD5" w:themeColor="accent5"/>
+          <w:sz w:val="32"/>
+          <w:szCs w:val="32"/>
+          <w:u w:val="single"/>
+          <w:lang w:eastAsia="hu-HU"/>
+        </w:rPr>
+      </w:pPr>
+    </w:p>
+    <w:p>
+      <w:pPr>
+        <w:spacing w:before="100" w:beforeAutospacing="1" w:after="100" w:afterAutospacing="1" w:line="240" w:lineRule="auto"/>
+        <w:rPr>
+          <w:rFonts w:ascii="Times New Roman" w:eastAsia="Times New Roman" w:hAnsi="Times New Roman" w:cs="Times New Roman"/>
+          <w:sz w:val="32"/>
+          <w:szCs w:val="32"/>
+          <w:lang w:eastAsia="hu-HU"/>
+        </w:rPr>
+      </w:pPr>
+      <w:r>
+        <w:rPr>
+          <w:rFonts w:ascii="Times New Roman" w:eastAsia="Times New Roman" w:hAnsi="Times New Roman" w:cs="Times New Roman"/>
+          <w:b/>
+          <w:bCs/>
+          <w:sz w:val="32"/>
+          <w:szCs w:val="32"/>
+          <w:u w:val="single"/>
+          <w:lang w:eastAsia="hu-HU"/>
+        </w:rPr>
+        <w:t>Hozzáférés az alkalmazáshoz</w:t>
+      </w:r>
+      <w:r>
+        <w:rPr>
+          <w:rFonts w:ascii="Times New Roman" w:eastAsia="Times New Roman" w:hAnsi="Times New Roman" w:cs="Times New Roman"/>
+          <w:sz w:val="32"/>
+          <w:szCs w:val="32"/>
+          <w:lang w:eastAsia="hu-HU"/>
+        </w:rPr>
+        <w:br/>
+        <w:t xml:space="preserve">A </w:t>
+      </w:r>
+      <w:proofErr w:type="spellStart"/>
+      <w:r>
+        <w:rPr>
+          <w:rFonts w:ascii="Times New Roman" w:eastAsia="Times New Roman" w:hAnsi="Times New Roman" w:cs="Times New Roman"/>
+          <w:sz w:val="32"/>
+          <w:szCs w:val="32"/>
+          <w:lang w:eastAsia="hu-HU"/>
+        </w:rPr>
+        <w:t>Zenelejátszó</w:t>
+      </w:r>
+      <w:proofErr w:type="spellEnd"/>
+      <w:r>
+        <w:rPr>
+          <w:rFonts w:ascii="Times New Roman" w:eastAsia="Times New Roman" w:hAnsi="Times New Roman" w:cs="Times New Roman"/>
+          <w:sz w:val="32"/>
+          <w:szCs w:val="32"/>
+          <w:lang w:eastAsia="hu-HU"/>
+        </w:rPr>
+        <w:t xml:space="preserve"> egy interneten keresztül elérhető webes alkalmazás, amelyhez nincs szükség telepítésre.</w:t>
+      </w:r>
+    </w:p>
+    <w:p>
+      <w:pPr>
+        <w:numPr>
+          <w:ilvl w:val="0"/>
+          <w:numId w:val="2"/>
+        </w:numPr>
+        <w:spacing w:before="100" w:beforeAutospacing="1" w:after="100" w:afterAutospacing="1" w:line="240" w:lineRule="auto"/>
+        <w:rPr>
+          <w:rFonts w:ascii="Times New Roman" w:eastAsia="Times New Roman" w:hAnsi="Times New Roman" w:cs="Times New Roman"/>
+          <w:sz w:val="32"/>
+          <w:szCs w:val="32"/>
+          <w:lang w:eastAsia="hu-HU"/>
+        </w:rPr>
+      </w:pPr>
+      <w:r>
+        <w:rPr>
+          <w:rFonts w:ascii="Times New Roman" w:eastAsia="Times New Roman" w:hAnsi="Times New Roman" w:cs="Times New Roman"/>
+          <w:sz w:val="32"/>
+          <w:szCs w:val="32"/>
+          <w:lang w:eastAsia="hu-HU"/>
+        </w:rPr>
+        <w:t xml:space="preserve">Nyisd meg a böngészőt az eszközödön (pl. Google Chrome, Mozilla Firefox, </w:t>
+      </w:r>
+      <w:proofErr w:type="spellStart"/>
+      <w:r>
+        <w:rPr>
+          <w:rFonts w:ascii="Times New Roman" w:eastAsia="Times New Roman" w:hAnsi="Times New Roman" w:cs="Times New Roman"/>
+          <w:sz w:val="32"/>
+          <w:szCs w:val="32"/>
+          <w:lang w:eastAsia="hu-HU"/>
+        </w:rPr>
+        <w:t>Safari</w:t>
+      </w:r>
+      <w:proofErr w:type="spellEnd"/>
+      <w:r>
+        <w:rPr>
+          <w:rFonts w:ascii="Times New Roman" w:eastAsia="Times New Roman" w:hAnsi="Times New Roman" w:cs="Times New Roman"/>
+          <w:sz w:val="32"/>
+          <w:szCs w:val="32"/>
+          <w:lang w:eastAsia="hu-HU"/>
+        </w:rPr>
+        <w:t>).</w:t>
+      </w:r>
+    </w:p>
+    <w:p>
+      <w:pPr>
+        <w:numPr>
+          <w:ilvl w:val="0"/>
+          <w:numId w:val="2"/>
+        </w:numPr>
+        <w:spacing w:before="100" w:beforeAutospacing="1" w:after="100" w:afterAutospacing="1" w:line="240" w:lineRule="auto"/>
+        <w:rPr>
+          <w:rFonts w:ascii="Times New Roman" w:eastAsia="Times New Roman" w:hAnsi="Times New Roman" w:cs="Times New Roman"/>
+          <w:sz w:val="32"/>
+          <w:szCs w:val="32"/>
+          <w:lang w:eastAsia="hu-HU"/>
+        </w:rPr>
+      </w:pPr>
+      <w:r>
+        <w:rPr>
+          <w:rFonts w:ascii="Times New Roman" w:eastAsia="Times New Roman" w:hAnsi="Times New Roman" w:cs="Times New Roman"/>
+          <w:sz w:val="32"/>
+          <w:szCs w:val="32"/>
+          <w:lang w:eastAsia="hu-HU"/>
+        </w:rPr>
+        <w:t>Keress rá a „</w:t>
+      </w:r>
+      <w:r>
+        <w:rPr>
+          <w:rFonts w:ascii="Times New Roman" w:eastAsia="Times New Roman" w:hAnsi="Times New Roman" w:cs="Times New Roman"/>
+          <w:i/>
+          <w:sz w:val="32"/>
+          <w:szCs w:val="32"/>
+          <w:lang w:eastAsia="hu-HU"/>
+        </w:rPr>
+        <w:t>MELODYFLOW</w:t>
+      </w:r>
+      <w:r>
+        <w:rPr>
+          <w:rFonts w:ascii="Times New Roman" w:eastAsia="Times New Roman" w:hAnsi="Times New Roman" w:cs="Times New Roman"/>
+          <w:i/>
+          <w:sz w:val="32"/>
+          <w:szCs w:val="32"/>
+          <w:lang w:eastAsia="hu-HU"/>
+        </w:rPr>
+        <w:t>”</w:t>
+      </w:r>
+      <w:r>
+        <w:rPr>
+          <w:rFonts w:ascii="Times New Roman" w:eastAsia="Times New Roman" w:hAnsi="Times New Roman" w:cs="Times New Roman"/>
+          <w:sz w:val="32"/>
+          <w:szCs w:val="32"/>
+          <w:lang w:eastAsia="hu-HU"/>
+        </w:rPr>
+        <w:t xml:space="preserve"> névre, hogy könnyedén elérhesd a program hivatalos weboldalát.</w:t>
+      </w:r>
+    </w:p>
+    <w:p>
+      <w:pPr>
+        <w:numPr>
+          <w:ilvl w:val="0"/>
+          <w:numId w:val="2"/>
+        </w:numPr>
+        <w:spacing w:before="100" w:beforeAutospacing="1" w:after="100" w:afterAutospacing="1" w:line="240" w:lineRule="auto"/>
+        <w:rPr>
+          <w:rFonts w:ascii="Times New Roman" w:eastAsia="Times New Roman" w:hAnsi="Times New Roman" w:cs="Times New Roman"/>
+          <w:sz w:val="32"/>
+          <w:szCs w:val="32"/>
+          <w:lang w:eastAsia="hu-HU"/>
+        </w:rPr>
+      </w:pPr>
+      <w:r>
+        <w:rPr>
+          <w:rFonts w:ascii="Times New Roman" w:eastAsia="Times New Roman" w:hAnsi="Times New Roman" w:cs="Times New Roman"/>
+          <w:sz w:val="32"/>
+          <w:szCs w:val="32"/>
+          <w:lang w:eastAsia="hu-HU"/>
+        </w:rPr>
+        <w:t>Regisztrálj egy fiókot, vagy jelentkezz be meglévő felhasználónévvel és jelszóval.</w:t>
+      </w:r>
+    </w:p>
+    <w:p>
+      <w:pPr>
+        <w:spacing w:before="100" w:beforeAutospacing="1" w:after="100" w:afterAutospacing="1" w:line="240" w:lineRule="auto"/>
+        <w:ind w:left="720"/>
+        <w:rPr>
+          <w:rFonts w:ascii="Times New Roman" w:eastAsia="Times New Roman" w:hAnsi="Times New Roman" w:cs="Times New Roman"/>
+          <w:sz w:val="32"/>
+          <w:szCs w:val="32"/>
+          <w:lang w:eastAsia="hu-HU"/>
+        </w:rPr>
+      </w:pPr>
+    </w:p>
+    <w:p>
+      <w:pPr>
+        <w:spacing w:before="100" w:beforeAutospacing="1" w:after="100" w:afterAutospacing="1" w:line="240" w:lineRule="auto"/>
+        <w:rPr>
+          <w:rFonts w:ascii="Times New Roman" w:eastAsia="Times New Roman" w:hAnsi="Times New Roman" w:cs="Times New Roman"/>
+          <w:sz w:val="32"/>
+          <w:szCs w:val="32"/>
+          <w:u w:val="single"/>
+          <w:lang w:eastAsia="hu-HU"/>
+        </w:rPr>
+      </w:pPr>
+      <w:r>
+        <w:rPr>
+          <w:rFonts w:ascii="Times New Roman" w:eastAsia="Times New Roman" w:hAnsi="Times New Roman" w:cs="Times New Roman"/>
+          <w:b/>
+          <w:bCs/>
+          <w:sz w:val="32"/>
+          <w:szCs w:val="32"/>
+          <w:u w:val="single"/>
+          <w:lang w:eastAsia="hu-HU"/>
+        </w:rPr>
+        <w:t>Zenei fájlok hozzáadása</w:t>
+      </w:r>
+      <w:bookmarkStart w:id="0" w:name="_GoBack"/>
+      <w:bookmarkEnd w:id="0"/>
+    </w:p>
+    <w:p>
+      <w:pPr>
+        <w:numPr>
+          <w:ilvl w:val="0"/>
+          <w:numId w:val="3"/>
+        </w:numPr>
+        <w:spacing w:before="100" w:beforeAutospacing="1" w:after="100" w:afterAutospacing="1" w:line="240" w:lineRule="auto"/>
+        <w:rPr>
+          <w:rFonts w:ascii="Times New Roman" w:eastAsia="Times New Roman" w:hAnsi="Times New Roman" w:cs="Times New Roman"/>
+          <w:sz w:val="32"/>
+          <w:szCs w:val="32"/>
+          <w:lang w:eastAsia="hu-HU"/>
+        </w:rPr>
+      </w:pPr>
+      <w:r>
+        <w:rPr>
+          <w:rFonts w:ascii="Times New Roman" w:eastAsia="Times New Roman" w:hAnsi="Times New Roman" w:cs="Times New Roman"/>
+          <w:sz w:val="32"/>
+          <w:szCs w:val="32"/>
+          <w:lang w:eastAsia="hu-HU"/>
+        </w:rPr>
+        <w:t xml:space="preserve">Használhatod az online elérhető zenei könyvtárakat, vagy </w:t>
+      </w:r>
+      <w:proofErr w:type="spellStart"/>
+      <w:r>
+        <w:rPr>
+          <w:rFonts w:ascii="Times New Roman" w:eastAsia="Times New Roman" w:hAnsi="Times New Roman" w:cs="Times New Roman"/>
+          <w:sz w:val="32"/>
+          <w:szCs w:val="32"/>
+          <w:lang w:eastAsia="hu-HU"/>
+        </w:rPr>
+        <w:t>feltöltheted</w:t>
+      </w:r>
+      <w:proofErr w:type="spellEnd"/>
+      <w:r>
+        <w:rPr>
+          <w:rFonts w:ascii="Times New Roman" w:eastAsia="Times New Roman" w:hAnsi="Times New Roman" w:cs="Times New Roman"/>
+          <w:sz w:val="32"/>
+          <w:szCs w:val="32"/>
+          <w:lang w:eastAsia="hu-HU"/>
+        </w:rPr>
+        <w:t xml:space="preserve"> a saját zenefájljaidat a "Fájlok hozzáadása" opcióval.</w:t>
+      </w:r>
+    </w:p>
+    <w:p>
+      <w:pPr>
+        <w:spacing w:before="100" w:beforeAutospacing="1" w:after="100" w:afterAutospacing="1" w:line="240" w:lineRule="auto"/>
+        <w:rPr>
+          <w:rFonts w:ascii="Times New Roman" w:eastAsia="Times New Roman" w:hAnsi="Times New Roman" w:cs="Times New Roman"/>
+          <w:sz w:val="32"/>
+          <w:szCs w:val="32"/>
+          <w:lang w:eastAsia="hu-HU"/>
+        </w:rPr>
+      </w:pPr>
+    </w:p>
+    <w:p>
+      <w:pPr>
+        <w:spacing w:before="100" w:beforeAutospacing="1" w:after="100" w:afterAutospacing="1" w:line="240" w:lineRule="auto"/>
+        <w:rPr>
+          <w:rFonts w:ascii="Times New Roman" w:eastAsia="Times New Roman" w:hAnsi="Times New Roman" w:cs="Times New Roman"/>
+          <w:sz w:val="32"/>
+          <w:szCs w:val="32"/>
+          <w:u w:val="single"/>
+          <w:lang w:eastAsia="hu-HU"/>
+        </w:rPr>
+      </w:pPr>
+      <w:r>
+        <w:rPr>
+          <w:rFonts w:ascii="Times New Roman" w:eastAsia="Times New Roman" w:hAnsi="Times New Roman" w:cs="Times New Roman"/>
+          <w:b/>
+          <w:bCs/>
+          <w:sz w:val="32"/>
+          <w:szCs w:val="32"/>
+          <w:u w:val="single"/>
+          <w:lang w:eastAsia="hu-HU"/>
+        </w:rPr>
+        <w:t>Navigáció a kezelőfelületen</w:t>
+      </w:r>
+    </w:p>
+    <w:p>
+      <w:pPr>
+        <w:numPr>
+          <w:ilvl w:val="0"/>
+          <w:numId w:val="5"/>
+        </w:numPr>
+        <w:spacing w:before="100" w:beforeAutospacing="1" w:after="100" w:afterAutospacing="1" w:line="240" w:lineRule="auto"/>
+        <w:rPr>
+          <w:rFonts w:ascii="Times New Roman" w:eastAsia="Times New Roman" w:hAnsi="Times New Roman" w:cs="Times New Roman"/>
+          <w:sz w:val="32"/>
+          <w:szCs w:val="32"/>
+          <w:lang w:eastAsia="hu-HU"/>
+        </w:rPr>
+      </w:pPr>
+      <w:r>
+        <w:rPr>
+          <w:rFonts w:ascii="Times New Roman" w:eastAsia="Times New Roman" w:hAnsi="Times New Roman" w:cs="Times New Roman"/>
+          <w:bCs/>
+          <w:sz w:val="32"/>
+          <w:szCs w:val="32"/>
+          <w:lang w:eastAsia="hu-HU"/>
+        </w:rPr>
+        <w:t>Keresőmező</w:t>
+      </w:r>
+      <w:r>
+        <w:rPr>
+          <w:rFonts w:ascii="Times New Roman" w:eastAsia="Times New Roman" w:hAnsi="Times New Roman" w:cs="Times New Roman"/>
+          <w:sz w:val="32"/>
+          <w:szCs w:val="32"/>
+          <w:lang w:eastAsia="hu-HU"/>
+        </w:rPr>
+        <w:t>: A bal felső sarokban található kereső ikonra kattintva gyorsan kereshetsz zenéket a könyvtárban vagy online adatbázisban.</w:t>
+      </w:r>
+    </w:p>
+    <w:p>
+      <w:pPr>
+        <w:numPr>
+          <w:ilvl w:val="0"/>
+          <w:numId w:val="5"/>
+        </w:numPr>
+        <w:spacing w:before="100" w:beforeAutospacing="1" w:after="100" w:afterAutospacing="1" w:line="240" w:lineRule="auto"/>
+        <w:rPr>
+          <w:rFonts w:ascii="Times New Roman" w:eastAsia="Times New Roman" w:hAnsi="Times New Roman" w:cs="Times New Roman"/>
+          <w:sz w:val="32"/>
+          <w:szCs w:val="32"/>
+          <w:lang w:eastAsia="hu-HU"/>
+        </w:rPr>
+      </w:pPr>
+      <w:r>
+        <w:rPr>
+          <w:rFonts w:ascii="Times New Roman" w:eastAsia="Times New Roman" w:hAnsi="Times New Roman" w:cs="Times New Roman"/>
+          <w:bCs/>
+          <w:sz w:val="32"/>
+          <w:szCs w:val="32"/>
+          <w:lang w:eastAsia="hu-HU"/>
+        </w:rPr>
+        <w:t>Oldalsó menü</w:t>
+      </w:r>
+      <w:r>
+        <w:rPr>
+          <w:rFonts w:ascii="Times New Roman" w:eastAsia="Times New Roman" w:hAnsi="Times New Roman" w:cs="Times New Roman"/>
+          <w:sz w:val="32"/>
+          <w:szCs w:val="32"/>
+          <w:lang w:eastAsia="hu-HU"/>
+        </w:rPr>
+        <w:t>: Az oldalsó menü gombjai segítségével könnyen elérheted a kezdőlapot, a kedvenceidet és a saját lejátszási listáidat.</w:t>
+      </w:r>
+    </w:p>
+    <w:p>
+      <w:pPr>
+        <w:spacing w:before="100" w:beforeAutospacing="1" w:after="100" w:afterAutospacing="1" w:line="240" w:lineRule="auto"/>
+        <w:rPr>
+          <w:rFonts w:ascii="Times New Roman" w:eastAsia="Times New Roman" w:hAnsi="Times New Roman" w:cs="Times New Roman"/>
+          <w:sz w:val="32"/>
+          <w:szCs w:val="32"/>
+          <w:lang w:eastAsia="hu-HU"/>
+        </w:rPr>
+      </w:pPr>
+    </w:p>
+    <w:p>
+      <w:pPr>
+        <w:spacing w:before="100" w:beforeAutospacing="1" w:after="100" w:afterAutospacing="1" w:line="240" w:lineRule="auto"/>
+        <w:rPr>
+          <w:rFonts w:ascii="Times New Roman" w:eastAsia="Times New Roman" w:hAnsi="Times New Roman" w:cs="Times New Roman"/>
+          <w:sz w:val="32"/>
+          <w:szCs w:val="32"/>
+          <w:u w:val="single"/>
+          <w:lang w:eastAsia="hu-HU"/>
+        </w:rPr>
+      </w:pPr>
+      <w:proofErr w:type="spellStart"/>
+      <w:r>
+        <w:rPr>
+          <w:rFonts w:ascii="Times New Roman" w:eastAsia="Times New Roman" w:hAnsi="Times New Roman" w:cs="Times New Roman"/>
+          <w:b/>
+          <w:bCs/>
+          <w:sz w:val="32"/>
+          <w:szCs w:val="32"/>
+          <w:u w:val="single"/>
+          <w:lang w:eastAsia="hu-HU"/>
+        </w:rPr>
+        <w:lastRenderedPageBreak/>
+        <w:t>Zenelejátszó</w:t>
+      </w:r>
+      <w:proofErr w:type="spellEnd"/>
+      <w:r>
+        <w:rPr>
+          <w:rFonts w:ascii="Times New Roman" w:eastAsia="Times New Roman" w:hAnsi="Times New Roman" w:cs="Times New Roman"/>
+          <w:b/>
+          <w:bCs/>
+          <w:sz w:val="32"/>
+          <w:szCs w:val="32"/>
+          <w:u w:val="single"/>
+          <w:lang w:eastAsia="hu-HU"/>
+        </w:rPr>
+        <w:t xml:space="preserve"> funkciók</w:t>
+      </w:r>
+    </w:p>
+    <w:p>
+      <w:pPr>
+        <w:numPr>
+          <w:ilvl w:val="0"/>
+          <w:numId w:val="6"/>
+        </w:numPr>
+        <w:spacing w:before="100" w:beforeAutospacing="1" w:after="100" w:afterAutospacing="1" w:line="240" w:lineRule="auto"/>
+        <w:rPr>
+          <w:rFonts w:ascii="Times New Roman" w:eastAsia="Times New Roman" w:hAnsi="Times New Roman" w:cs="Times New Roman"/>
+          <w:sz w:val="32"/>
+          <w:szCs w:val="32"/>
+          <w:lang w:eastAsia="hu-HU"/>
+        </w:rPr>
+      </w:pPr>
+      <w:r>
+        <w:rPr>
+          <w:rFonts w:ascii="Times New Roman" w:eastAsia="Times New Roman" w:hAnsi="Times New Roman" w:cs="Times New Roman"/>
+          <w:sz w:val="32"/>
+          <w:szCs w:val="32"/>
+          <w:lang w:eastAsia="hu-HU"/>
+        </w:rPr>
+        <w:t>A fő képernyő központi részén található a lejátszott zeneszám adatai: szerző, cím és rövid leírás.</w:t>
+      </w:r>
+    </w:p>
+    <w:p>
+      <w:pPr>
+        <w:numPr>
+          <w:ilvl w:val="0"/>
+          <w:numId w:val="6"/>
+        </w:numPr>
+        <w:spacing w:before="100" w:beforeAutospacing="1" w:after="100" w:afterAutospacing="1" w:line="240" w:lineRule="auto"/>
+        <w:rPr>
+          <w:rFonts w:ascii="Times New Roman" w:eastAsia="Times New Roman" w:hAnsi="Times New Roman" w:cs="Times New Roman"/>
+          <w:sz w:val="32"/>
+          <w:szCs w:val="32"/>
+          <w:lang w:eastAsia="hu-HU"/>
+        </w:rPr>
+      </w:pPr>
+      <w:r>
+        <w:rPr>
+          <w:rFonts w:ascii="Times New Roman" w:eastAsia="Times New Roman" w:hAnsi="Times New Roman" w:cs="Times New Roman"/>
+          <w:sz w:val="32"/>
+          <w:szCs w:val="32"/>
+          <w:lang w:eastAsia="hu-HU"/>
+        </w:rPr>
+        <w:t>A "Lejátszás" gombbal elindíthatod a lejátszást, vagy szüneteltetheted azt.</w:t>
+      </w:r>
+    </w:p>
+    <w:p>
+      <w:pPr>
+        <w:spacing w:before="100" w:beforeAutospacing="1" w:after="100" w:afterAutospacing="1" w:line="240" w:lineRule="auto"/>
+        <w:rPr>
+          <w:rFonts w:ascii="Times New Roman" w:eastAsia="Times New Roman" w:hAnsi="Times New Roman" w:cs="Times New Roman"/>
+          <w:sz w:val="32"/>
+          <w:szCs w:val="32"/>
+          <w:lang w:eastAsia="hu-HU"/>
+        </w:rPr>
+      </w:pPr>
+    </w:p>
+    <w:p>
+      <w:pPr>
+        <w:spacing w:before="100" w:beforeAutospacing="1" w:after="100" w:afterAutospacing="1" w:line="240" w:lineRule="auto"/>
+        <w:rPr>
+          <w:rFonts w:ascii="Times New Roman" w:eastAsia="Times New Roman" w:hAnsi="Times New Roman" w:cs="Times New Roman"/>
+          <w:sz w:val="32"/>
+          <w:szCs w:val="32"/>
+          <w:u w:val="single"/>
+          <w:lang w:eastAsia="hu-HU"/>
+        </w:rPr>
+      </w:pPr>
+      <w:proofErr w:type="spellStart"/>
+      <w:r>
+        <w:rPr>
+          <w:rFonts w:ascii="Times New Roman" w:eastAsia="Times New Roman" w:hAnsi="Times New Roman" w:cs="Times New Roman"/>
+          <w:b/>
+          <w:bCs/>
+          <w:sz w:val="32"/>
+          <w:szCs w:val="32"/>
+          <w:u w:val="single"/>
+          <w:lang w:eastAsia="hu-HU"/>
+        </w:rPr>
+        <w:t>Lejátszósáv</w:t>
+      </w:r>
+      <w:proofErr w:type="spellEnd"/>
+      <w:r>
+        <w:rPr>
+          <w:rFonts w:ascii="Times New Roman" w:eastAsia="Times New Roman" w:hAnsi="Times New Roman" w:cs="Times New Roman"/>
+          <w:b/>
+          <w:bCs/>
+          <w:sz w:val="32"/>
+          <w:szCs w:val="32"/>
+          <w:u w:val="single"/>
+          <w:lang w:eastAsia="hu-HU"/>
+        </w:rPr>
+        <w:t xml:space="preserve"> és vezérlés</w:t>
+      </w:r>
+    </w:p>
+    <w:p>
+      <w:pPr>
+        <w:numPr>
+          <w:ilvl w:val="0"/>
+          <w:numId w:val="7"/>
+        </w:numPr>
+        <w:spacing w:before="100" w:beforeAutospacing="1" w:after="100" w:afterAutospacing="1" w:line="240" w:lineRule="auto"/>
+        <w:rPr>
+          <w:rFonts w:ascii="Times New Roman" w:eastAsia="Times New Roman" w:hAnsi="Times New Roman" w:cs="Times New Roman"/>
+          <w:sz w:val="32"/>
+          <w:szCs w:val="32"/>
+          <w:lang w:eastAsia="hu-HU"/>
+        </w:rPr>
+      </w:pPr>
+      <w:r>
+        <w:rPr>
+          <w:rFonts w:ascii="Times New Roman" w:eastAsia="Times New Roman" w:hAnsi="Times New Roman" w:cs="Times New Roman"/>
+          <w:sz w:val="32"/>
+          <w:szCs w:val="32"/>
+          <w:lang w:eastAsia="hu-HU"/>
+        </w:rPr>
+        <w:t>Az alsó sáv tartalmazza az aktuális zeneszám címét és előadóját, a lejátszás előrehaladását, valamint vezérlőgombokat, például:</w:t>
+      </w:r>
+    </w:p>
+    <w:p>
+      <w:pPr>
+        <w:numPr>
+          <w:ilvl w:val="1"/>
+          <w:numId w:val="7"/>
+        </w:numPr>
+        <w:spacing w:before="100" w:beforeAutospacing="1" w:after="100" w:afterAutospacing="1" w:line="240" w:lineRule="auto"/>
+        <w:rPr>
+          <w:rFonts w:ascii="Times New Roman" w:eastAsia="Times New Roman" w:hAnsi="Times New Roman" w:cs="Times New Roman"/>
+          <w:sz w:val="32"/>
+          <w:szCs w:val="32"/>
+          <w:lang w:eastAsia="hu-HU"/>
+        </w:rPr>
+      </w:pPr>
+      <w:r>
+        <w:rPr>
+          <w:rFonts w:ascii="Times New Roman" w:eastAsia="Times New Roman" w:hAnsi="Times New Roman" w:cs="Times New Roman"/>
+          <w:bCs/>
+          <w:sz w:val="32"/>
+          <w:szCs w:val="32"/>
+          <w:lang w:eastAsia="hu-HU"/>
+        </w:rPr>
+        <w:t>Vissza</w:t>
+      </w:r>
+      <w:r>
+        <w:rPr>
+          <w:rFonts w:ascii="Times New Roman" w:eastAsia="Times New Roman" w:hAnsi="Times New Roman" w:cs="Times New Roman"/>
+          <w:sz w:val="32"/>
+          <w:szCs w:val="32"/>
+          <w:lang w:eastAsia="hu-HU"/>
+        </w:rPr>
+        <w:t xml:space="preserve"> és </w:t>
+      </w:r>
+      <w:r>
+        <w:rPr>
+          <w:rFonts w:ascii="Times New Roman" w:eastAsia="Times New Roman" w:hAnsi="Times New Roman" w:cs="Times New Roman"/>
+          <w:bCs/>
+          <w:sz w:val="32"/>
+          <w:szCs w:val="32"/>
+          <w:lang w:eastAsia="hu-HU"/>
+        </w:rPr>
+        <w:t>előre</w:t>
+      </w:r>
+      <w:r>
+        <w:rPr>
+          <w:rFonts w:ascii="Times New Roman" w:eastAsia="Times New Roman" w:hAnsi="Times New Roman" w:cs="Times New Roman"/>
+          <w:sz w:val="32"/>
+          <w:szCs w:val="32"/>
+          <w:lang w:eastAsia="hu-HU"/>
+        </w:rPr>
+        <w:t xml:space="preserve"> gombok a számok közötti váltáshoz.</w:t>
+      </w:r>
+    </w:p>
+    <w:p>
+      <w:pPr>
+        <w:numPr>
+          <w:ilvl w:val="1"/>
+          <w:numId w:val="7"/>
+        </w:numPr>
+        <w:spacing w:before="100" w:beforeAutospacing="1" w:after="100" w:afterAutospacing="1" w:line="240" w:lineRule="auto"/>
+        <w:rPr>
+          <w:rFonts w:ascii="Times New Roman" w:eastAsia="Times New Roman" w:hAnsi="Times New Roman" w:cs="Times New Roman"/>
+          <w:sz w:val="32"/>
+          <w:szCs w:val="32"/>
+          <w:lang w:eastAsia="hu-HU"/>
+        </w:rPr>
+      </w:pPr>
+      <w:r>
+        <w:rPr>
+          <w:rFonts w:ascii="Times New Roman" w:eastAsia="Times New Roman" w:hAnsi="Times New Roman" w:cs="Times New Roman"/>
+          <w:bCs/>
+          <w:sz w:val="32"/>
+          <w:szCs w:val="32"/>
+          <w:lang w:eastAsia="hu-HU"/>
+        </w:rPr>
+        <w:t>Sebesség</w:t>
+      </w:r>
+      <w:r>
+        <w:rPr>
+          <w:rFonts w:ascii="Times New Roman" w:eastAsia="Times New Roman" w:hAnsi="Times New Roman" w:cs="Times New Roman"/>
+          <w:b/>
+          <w:bCs/>
+          <w:sz w:val="32"/>
+          <w:szCs w:val="32"/>
+          <w:lang w:eastAsia="hu-HU"/>
+        </w:rPr>
+        <w:t xml:space="preserve"> </w:t>
+      </w:r>
+      <w:r>
+        <w:rPr>
+          <w:rFonts w:ascii="Times New Roman" w:eastAsia="Times New Roman" w:hAnsi="Times New Roman" w:cs="Times New Roman"/>
+          <w:bCs/>
+          <w:sz w:val="32"/>
+          <w:szCs w:val="32"/>
+          <w:lang w:eastAsia="hu-HU"/>
+        </w:rPr>
+        <w:t>állítás</w:t>
+      </w:r>
+      <w:r>
+        <w:rPr>
+          <w:rFonts w:ascii="Times New Roman" w:eastAsia="Times New Roman" w:hAnsi="Times New Roman" w:cs="Times New Roman"/>
+          <w:sz w:val="32"/>
+          <w:szCs w:val="32"/>
+          <w:lang w:eastAsia="hu-HU"/>
+        </w:rPr>
+        <w:t>: Az 1x gomb segítségével állíthatod a lejátszás sebességét.</w:t>
+      </w:r>
+    </w:p>
+    <w:p>
+      <w:pPr>
+        <w:numPr>
+          <w:ilvl w:val="1"/>
+          <w:numId w:val="7"/>
+        </w:numPr>
+        <w:spacing w:before="100" w:beforeAutospacing="1" w:after="100" w:afterAutospacing="1" w:line="240" w:lineRule="auto"/>
+        <w:rPr>
+          <w:rFonts w:ascii="Times New Roman" w:eastAsia="Times New Roman" w:hAnsi="Times New Roman" w:cs="Times New Roman"/>
+          <w:sz w:val="32"/>
+          <w:szCs w:val="32"/>
+          <w:lang w:eastAsia="hu-HU"/>
+        </w:rPr>
+      </w:pPr>
+      <w:r>
+        <w:rPr>
+          <w:rFonts w:ascii="Times New Roman" w:eastAsia="Times New Roman" w:hAnsi="Times New Roman" w:cs="Times New Roman"/>
+          <w:bCs/>
+          <w:sz w:val="32"/>
+          <w:szCs w:val="32"/>
+          <w:lang w:eastAsia="hu-HU"/>
+        </w:rPr>
+        <w:t>Hangerő</w:t>
+      </w:r>
+      <w:r>
+        <w:rPr>
+          <w:rFonts w:ascii="Times New Roman" w:eastAsia="Times New Roman" w:hAnsi="Times New Roman" w:cs="Times New Roman"/>
+          <w:b/>
+          <w:bCs/>
+          <w:sz w:val="32"/>
+          <w:szCs w:val="32"/>
+          <w:lang w:eastAsia="hu-HU"/>
+        </w:rPr>
+        <w:t xml:space="preserve"> </w:t>
+      </w:r>
+      <w:r>
+        <w:rPr>
+          <w:rFonts w:ascii="Times New Roman" w:eastAsia="Times New Roman" w:hAnsi="Times New Roman" w:cs="Times New Roman"/>
+          <w:bCs/>
+          <w:sz w:val="32"/>
+          <w:szCs w:val="32"/>
+          <w:lang w:eastAsia="hu-HU"/>
+        </w:rPr>
+        <w:t>szabályozó</w:t>
+      </w:r>
+      <w:r>
+        <w:rPr>
+          <w:rFonts w:ascii="Times New Roman" w:eastAsia="Times New Roman" w:hAnsi="Times New Roman" w:cs="Times New Roman"/>
+          <w:sz w:val="32"/>
+          <w:szCs w:val="32"/>
+          <w:lang w:eastAsia="hu-HU"/>
+        </w:rPr>
+        <w:t>: Az ikonra kattintva növelheted vagy csökkentheted a hangerőt.</w:t>
+      </w:r>
+    </w:p>
+    <w:p>
+      <w:pPr>
+        <w:numPr>
+          <w:ilvl w:val="1"/>
+          <w:numId w:val="7"/>
+        </w:numPr>
+        <w:spacing w:before="100" w:beforeAutospacing="1" w:after="100" w:afterAutospacing="1" w:line="240" w:lineRule="auto"/>
+        <w:rPr>
+          <w:rFonts w:ascii="Times New Roman" w:eastAsia="Times New Roman" w:hAnsi="Times New Roman" w:cs="Times New Roman"/>
+          <w:sz w:val="32"/>
+          <w:szCs w:val="32"/>
+          <w:lang w:eastAsia="hu-HU"/>
+        </w:rPr>
+      </w:pPr>
+      <w:r>
+        <w:rPr>
+          <w:rFonts w:ascii="Times New Roman" w:eastAsia="Times New Roman" w:hAnsi="Times New Roman" w:cs="Times New Roman"/>
+          <w:bCs/>
+          <w:sz w:val="32"/>
+          <w:szCs w:val="32"/>
+          <w:lang w:eastAsia="hu-HU"/>
+        </w:rPr>
+        <w:t>Időzítő</w:t>
+      </w:r>
+      <w:r>
+        <w:rPr>
+          <w:rFonts w:ascii="Times New Roman" w:eastAsia="Times New Roman" w:hAnsi="Times New Roman" w:cs="Times New Roman"/>
+          <w:sz w:val="32"/>
+          <w:szCs w:val="32"/>
+          <w:lang w:eastAsia="hu-HU"/>
+        </w:rPr>
+        <w:t>: Az aktuális és teljes lejátszási idő nyomon követhető.</w:t>
+      </w:r>
+    </w:p>
+    <w:p>
+      <w:pPr>
+        <w:spacing w:before="100" w:beforeAutospacing="1" w:after="100" w:afterAutospacing="1" w:line="240" w:lineRule="auto"/>
+        <w:rPr>
+          <w:rFonts w:ascii="Times New Roman" w:eastAsia="Times New Roman" w:hAnsi="Times New Roman" w:cs="Times New Roman"/>
+          <w:sz w:val="32"/>
+          <w:szCs w:val="32"/>
+          <w:lang w:eastAsia="hu-HU"/>
+        </w:rPr>
+      </w:pPr>
+    </w:p>
+    <w:p>
+      <w:pPr>
+        <w:spacing w:before="100" w:beforeAutospacing="1" w:after="100" w:afterAutospacing="1" w:line="240" w:lineRule="auto"/>
+        <w:rPr>
+          <w:rFonts w:ascii="Times New Roman" w:eastAsia="Times New Roman" w:hAnsi="Times New Roman" w:cs="Times New Roman"/>
+          <w:sz w:val="32"/>
+          <w:szCs w:val="32"/>
+          <w:u w:val="single"/>
+          <w:lang w:eastAsia="hu-HU"/>
+        </w:rPr>
+      </w:pPr>
+      <w:r>
+        <w:rPr>
+          <w:rFonts w:ascii="Times New Roman" w:eastAsia="Times New Roman" w:hAnsi="Times New Roman" w:cs="Times New Roman"/>
+          <w:b/>
+          <w:bCs/>
+          <w:sz w:val="32"/>
+          <w:szCs w:val="32"/>
+          <w:u w:val="single"/>
+          <w:lang w:eastAsia="hu-HU"/>
+        </w:rPr>
+        <w:t>Kedvencek és lejátszási lista készítése és kezelése</w:t>
+      </w:r>
+    </w:p>
+    <w:p>
+      <w:pPr>
+        <w:numPr>
+          <w:ilvl w:val="0"/>
+          <w:numId w:val="8"/>
+        </w:numPr>
+        <w:spacing w:before="100" w:beforeAutospacing="1" w:after="100" w:afterAutospacing="1" w:line="240" w:lineRule="auto"/>
+        <w:rPr>
+          <w:rFonts w:ascii="Times New Roman" w:eastAsia="Times New Roman" w:hAnsi="Times New Roman" w:cs="Times New Roman"/>
+          <w:sz w:val="32"/>
+          <w:szCs w:val="32"/>
+          <w:lang w:eastAsia="hu-HU"/>
+        </w:rPr>
+      </w:pPr>
+      <w:r>
+        <w:rPr>
+          <w:rFonts w:ascii="Times New Roman" w:eastAsia="Times New Roman" w:hAnsi="Times New Roman" w:cs="Times New Roman"/>
+          <w:sz w:val="32"/>
+          <w:szCs w:val="32"/>
+          <w:lang w:eastAsia="hu-HU"/>
+        </w:rPr>
+        <w:t>A bal oldali "Kedvencek" menüpontban megtekintheted a kedvenc dalaidat.</w:t>
+      </w:r>
+    </w:p>
+    <w:p>
+      <w:pPr>
+        <w:numPr>
+          <w:ilvl w:val="0"/>
+          <w:numId w:val="8"/>
+        </w:numPr>
+        <w:spacing w:before="100" w:beforeAutospacing="1" w:after="100" w:afterAutospacing="1" w:line="240" w:lineRule="auto"/>
+        <w:rPr>
+          <w:rFonts w:ascii="Times New Roman" w:eastAsia="Times New Roman" w:hAnsi="Times New Roman" w:cs="Times New Roman"/>
+          <w:sz w:val="32"/>
+          <w:szCs w:val="32"/>
+          <w:lang w:eastAsia="hu-HU"/>
+        </w:rPr>
+      </w:pPr>
+      <w:r>
+        <w:rPr>
+          <w:rFonts w:ascii="Times New Roman" w:eastAsia="Times New Roman" w:hAnsi="Times New Roman" w:cs="Times New Roman"/>
+          <w:sz w:val="32"/>
+          <w:szCs w:val="32"/>
+          <w:lang w:eastAsia="hu-HU"/>
+        </w:rPr>
+        <w:t xml:space="preserve">A </w:t>
+      </w:r>
+      <w:proofErr w:type="spellStart"/>
+      <w:r>
+        <w:rPr>
+          <w:rFonts w:ascii="Times New Roman" w:eastAsia="Times New Roman" w:hAnsi="Times New Roman" w:cs="Times New Roman"/>
+          <w:sz w:val="32"/>
+          <w:szCs w:val="32"/>
+          <w:lang w:eastAsia="hu-HU"/>
+        </w:rPr>
+        <w:t>főmenüben</w:t>
+      </w:r>
+      <w:proofErr w:type="spellEnd"/>
+      <w:r>
+        <w:rPr>
+          <w:rFonts w:ascii="Times New Roman" w:eastAsia="Times New Roman" w:hAnsi="Times New Roman" w:cs="Times New Roman"/>
+          <w:sz w:val="32"/>
+          <w:szCs w:val="32"/>
+          <w:lang w:eastAsia="hu-HU"/>
+        </w:rPr>
+        <w:t xml:space="preserve"> válaszd a "Lejátszási lista létrehozása" lehetőséget.</w:t>
+      </w:r>
+    </w:p>
+    <w:p>
+      <w:pPr>
+        <w:numPr>
+          <w:ilvl w:val="0"/>
+          <w:numId w:val="8"/>
+        </w:numPr>
+        <w:spacing w:before="100" w:beforeAutospacing="1" w:after="100" w:afterAutospacing="1" w:line="240" w:lineRule="auto"/>
+        <w:rPr>
+          <w:rFonts w:ascii="Times New Roman" w:eastAsia="Times New Roman" w:hAnsi="Times New Roman" w:cs="Times New Roman"/>
+          <w:sz w:val="32"/>
+          <w:szCs w:val="32"/>
+          <w:lang w:eastAsia="hu-HU"/>
+        </w:rPr>
+      </w:pPr>
+      <w:r>
+        <w:rPr>
+          <w:rFonts w:ascii="Times New Roman" w:eastAsia="Times New Roman" w:hAnsi="Times New Roman" w:cs="Times New Roman"/>
+          <w:sz w:val="32"/>
+          <w:szCs w:val="32"/>
+          <w:lang w:eastAsia="hu-HU"/>
+        </w:rPr>
+        <w:t>Adj nevet a lejátszási listának, majd válassz zenéket az elérhető könyvtárból vagy a feltöltött fájlok közül.</w:t>
+      </w:r>
+    </w:p>
+    <w:p>
+      <w:pPr>
+        <w:numPr>
+          <w:ilvl w:val="0"/>
+          <w:numId w:val="8"/>
+        </w:numPr>
+        <w:spacing w:before="100" w:beforeAutospacing="1" w:after="100" w:afterAutospacing="1" w:line="240" w:lineRule="auto"/>
+        <w:rPr>
+          <w:rFonts w:ascii="Times New Roman" w:eastAsia="Times New Roman" w:hAnsi="Times New Roman" w:cs="Times New Roman"/>
+          <w:sz w:val="32"/>
+          <w:szCs w:val="32"/>
+          <w:lang w:eastAsia="hu-HU"/>
+        </w:rPr>
+      </w:pPr>
+      <w:r>
+        <w:rPr>
+          <w:rFonts w:ascii="Times New Roman" w:eastAsia="Times New Roman" w:hAnsi="Times New Roman" w:cs="Times New Roman"/>
+          <w:sz w:val="32"/>
+          <w:szCs w:val="32"/>
+          <w:lang w:eastAsia="hu-HU"/>
+        </w:rPr>
+        <w:t>A lejátszási lista mentése után az bármikor elérhető a fiókodban.</w:t>
+      </w:r>
+    </w:p>
+    <w:p>
+      <w:pPr>
+        <w:spacing w:before="100" w:beforeAutospacing="1" w:after="100" w:afterAutospacing="1" w:line="240" w:lineRule="auto"/>
+        <w:rPr>
+          <w:rFonts w:ascii="Times New Roman" w:eastAsia="Times New Roman" w:hAnsi="Times New Roman" w:cs="Times New Roman"/>
+          <w:sz w:val="32"/>
+          <w:szCs w:val="32"/>
+          <w:lang w:eastAsia="hu-HU"/>
+        </w:rPr>
+      </w:pPr>
+    </w:p>
+    <w:p>
+      <w:pPr>
+        <w:spacing w:before="100" w:beforeAutospacing="1" w:after="100" w:afterAutospacing="1" w:line="240" w:lineRule="auto"/>
+        <w:rPr>
+          <w:rFonts w:ascii="Times New Roman" w:eastAsia="Times New Roman" w:hAnsi="Times New Roman" w:cs="Times New Roman"/>
+          <w:sz w:val="32"/>
+          <w:szCs w:val="32"/>
+          <w:lang w:eastAsia="hu-HU"/>
+        </w:rPr>
+      </w:pPr>
+    </w:p>
+    <w:p>
+      <w:pPr>
+        <w:spacing w:before="100" w:beforeAutospacing="1" w:after="100" w:afterAutospacing="1" w:line="240" w:lineRule="auto"/>
+        <w:rPr>
+          <w:rFonts w:ascii="Times New Roman" w:eastAsia="Times New Roman" w:hAnsi="Times New Roman" w:cs="Times New Roman"/>
+          <w:sz w:val="32"/>
+          <w:szCs w:val="32"/>
+          <w:lang w:eastAsia="hu-HU"/>
+        </w:rPr>
+      </w:pPr>
+    </w:p>
+    <w:p>
+      <w:pPr>
+        <w:spacing w:before="100" w:beforeAutospacing="1" w:after="100" w:afterAutospacing="1" w:line="240" w:lineRule="auto"/>
+        <w:outlineLvl w:val="1"/>
+        <w:rPr>
+          <w:rFonts w:ascii="Times New Roman" w:eastAsia="Times New Roman" w:hAnsi="Times New Roman" w:cs="Times New Roman"/>
+          <w:b/>
+          <w:bCs/>
+          <w:color w:val="5B9BD5" w:themeColor="accent5"/>
+          <w:sz w:val="32"/>
+          <w:szCs w:val="32"/>
+          <w:u w:val="single"/>
+          <w:lang w:eastAsia="hu-HU"/>
+        </w:rPr>
+      </w:pPr>
+    </w:p>
+    <w:p>
+      <w:pPr>
+        <w:spacing w:before="100" w:beforeAutospacing="1" w:after="100" w:afterAutospacing="1" w:line="240" w:lineRule="auto"/>
+        <w:outlineLvl w:val="1"/>
+        <w:rPr>
+          <w:rFonts w:ascii="Times New Roman" w:eastAsia="Times New Roman" w:hAnsi="Times New Roman" w:cs="Times New Roman"/>
+          <w:b/>
+          <w:bCs/>
+          <w:color w:val="5B9BD5" w:themeColor="accent5"/>
+          <w:sz w:val="40"/>
+          <w:szCs w:val="40"/>
+          <w:u w:val="single"/>
+          <w:lang w:eastAsia="hu-HU"/>
+        </w:rPr>
+      </w:pPr>
+    </w:p>
+    <w:p>
+      <w:pPr>
+        <w:spacing w:before="100" w:beforeAutospacing="1" w:after="100" w:afterAutospacing="1" w:line="240" w:lineRule="auto"/>
+        <w:rPr>
+          <w:rFonts w:ascii="Times New Roman" w:eastAsia="Times New Roman" w:hAnsi="Times New Roman" w:cs="Times New Roman"/>
           <w:sz w:val="24"/>
           <w:szCs w:val="24"/>
           <w:lang w:eastAsia="hu-HU"/>
         </w:rPr>
       </w:pPr>
-      <w:r>
-        <w:rPr>
-          <w:rFonts w:ascii="Times New Roman" w:eastAsia="Times New Roman" w:hAnsi="Times New Roman" w:cs="Times New Roman"/>
-          <w:sz w:val="32"/>
-          <w:szCs w:val="32"/>
-          <w:lang w:eastAsia="hu-HU"/>
-        </w:rPr>
-        <w:t xml:space="preserve">A </w:t>
-      </w:r>
-      <w:proofErr w:type="spellStart"/>
-      <w:r>
-        <w:rPr>
-          <w:rFonts w:ascii="Times New Roman" w:eastAsia="Times New Roman" w:hAnsi="Times New Roman" w:cs="Times New Roman"/>
-          <w:sz w:val="32"/>
-          <w:szCs w:val="32"/>
-          <w:lang w:eastAsia="hu-HU"/>
-        </w:rPr>
-        <w:t>zenelejátszó</w:t>
-      </w:r>
-      <w:proofErr w:type="spellEnd"/>
-      <w:r>
-        <w:rPr>
-          <w:rFonts w:ascii="Times New Roman" w:eastAsia="Times New Roman" w:hAnsi="Times New Roman" w:cs="Times New Roman"/>
-          <w:sz w:val="32"/>
-          <w:szCs w:val="32"/>
-          <w:lang w:eastAsia="hu-HU"/>
-        </w:rPr>
-        <w:t xml:space="preserve"> </w:t>
-      </w:r>
-      <w:r>
-        <w:rPr>
-          <w:rFonts w:ascii="Times New Roman" w:eastAsia="Times New Roman" w:hAnsi="Times New Roman" w:cs="Times New Roman"/>
-          <w:sz w:val="32"/>
-          <w:szCs w:val="32"/>
-          <w:lang w:eastAsia="hu-HU"/>
-        </w:rPr>
-        <w:t>alkalmazás</w:t>
-      </w:r>
-      <w:r>
-        <w:rPr>
-          <w:rFonts w:ascii="Times New Roman" w:eastAsia="Times New Roman" w:hAnsi="Times New Roman" w:cs="Times New Roman"/>
-          <w:sz w:val="32"/>
-          <w:szCs w:val="32"/>
-          <w:lang w:eastAsia="hu-HU"/>
-        </w:rPr>
-        <w:t xml:space="preserve"> elérhető mobiltelefonról és minden olyan eszközről, amely rendelkezik internetkapcsolattal.</w:t>
-      </w:r>
-      <w:bookmarkStart w:id="0" w:name="_GoBack"/>
-      <w:bookmarkEnd w:id="0"/>
     </w:p>
     <w:p>
       <w:pPr>
@@ -655,6 +1745,453 @@
 <file path=word/numbering.xml><?xml version="1.0" encoding="utf-8"?>
 <w:numbering xmlns:wpc="http://schemas.microsoft.com/office/word/2010/wordprocessingCanvas" xmlns:cx="http://schemas.microsoft.com/office/drawing/2014/chartex" xmlns:cx1="http://schemas.microsoft.com/office/drawing/2015/9/8/chartex" xmlns:cx2="http://schemas.microsoft.com/office/drawing/2015/10/21/chartex" xmlns:cx3="http://schemas.microsoft.com/office/drawing/2016/5/9/chartex" xmlns:cx4="http://schemas.microsoft.com/office/drawing/2016/5/10/chartex" xmlns:cx5="http://schemas.microsoft.com/office/drawing/2016/5/11/chartex" xmlns:cx6="http://schemas.microsoft.com/office/drawing/2016/5/12/chartex" xmlns:cx7="http://schemas.microsoft.com/office/drawing/2016/5/13/chartex" xmlns:cx8="http://schemas.microsoft.com/office/drawing/2016/5/14/chartex" xmlns:mc="http://schemas.openxmlformats.org/markup-compatibility/2006" xmlns:aink="http://schemas.microsoft.com/office/drawing/2016/ink" xmlns:am3d="http://schemas.microsoft.com/office/drawing/2017/model3d" xmlns:o="urn:schemas-microsoft-com:office:office" xmlns:r="http://schemas.openxmlformats.org/officeDocument/2006/relationships" xmlns:m="http://schemas.openxmlformats.org/officeDocument/2006/math" xmlns:v="urn:schemas-microsoft-com:vml" xmlns:wp14="http://schemas.microsoft.com/office/word/2010/wordprocessingDrawing" xmlns:wp="http://schemas.openxmlformats.org/drawingml/2006/wordprocessingDrawing" xmlns:w10="urn:schemas-microsoft-com:office:word" xmlns:w="http://schemas.openxmlformats.org/wordprocessingml/2006/main" xmlns:w14="http://schemas.microsoft.com/office/word/2010/wordml" xmlns:w15="http://schemas.microsoft.com/office/word/2012/wordml" xmlns:w16cid="http://schemas.microsoft.com/office/word/2016/wordml/cid" xmlns:w16se="http://schemas.microsoft.com/office/word/2015/wordml/symex" xmlns:wpg="http://schemas.microsoft.com/office/word/2010/wordprocessingGroup" xmlns:wpi="http://schemas.microsoft.com/office/word/2010/wordprocessingInk" xmlns:wne="http://schemas.microsoft.com/office/word/2006/wordml" xmlns:wps="http://schemas.microsoft.com/office/word/2010/wordprocessingShape" mc:Ignorable="w14 w15 w16se w16cid wp14">
   <w:abstractNum w:abstractNumId="0" w15:restartNumberingAfterBreak="0">
+    <w:nsid w:val="08C4788C"/>
+    <w:multiLevelType w:val="multilevel"/>
+    <w:tmpl w:val="C70EEC4A"/>
+    <w:lvl w:ilvl="0">
+      <w:start w:val="1"/>
+      <w:numFmt w:val="bullet"/>
+      <w:lvlText w:val=""/>
+      <w:lvlJc w:val="left"/>
+      <w:pPr>
+        <w:tabs>
+          <w:tab w:val="num" w:pos="720"/>
+        </w:tabs>
+        <w:ind w:left="720" w:hanging="360"/>
+      </w:pPr>
+      <w:rPr>
+        <w:rFonts w:ascii="Symbol" w:hAnsi="Symbol" w:hint="default"/>
+        <w:sz w:val="20"/>
+      </w:rPr>
+    </w:lvl>
+    <w:lvl w:ilvl="1" w:tentative="1">
+      <w:start w:val="1"/>
+      <w:numFmt w:val="bullet"/>
+      <w:lvlText w:val="o"/>
+      <w:lvlJc w:val="left"/>
+      <w:pPr>
+        <w:tabs>
+          <w:tab w:val="num" w:pos="1440"/>
+        </w:tabs>
+        <w:ind w:left="1440" w:hanging="360"/>
+      </w:pPr>
+      <w:rPr>
+        <w:rFonts w:ascii="Courier New" w:hAnsi="Courier New" w:hint="default"/>
+        <w:sz w:val="20"/>
+      </w:rPr>
+    </w:lvl>
+    <w:lvl w:ilvl="2" w:tentative="1">
+      <w:start w:val="1"/>
+      <w:numFmt w:val="bullet"/>
+      <w:lvlText w:val=""/>
+      <w:lvlJc w:val="left"/>
+      <w:pPr>
+        <w:tabs>
+          <w:tab w:val="num" w:pos="2160"/>
+        </w:tabs>
+        <w:ind w:left="2160" w:hanging="360"/>
+      </w:pPr>
+      <w:rPr>
+        <w:rFonts w:ascii="Wingdings" w:hAnsi="Wingdings" w:hint="default"/>
+        <w:sz w:val="20"/>
+      </w:rPr>
+    </w:lvl>
+    <w:lvl w:ilvl="3" w:tentative="1">
+      <w:start w:val="1"/>
+      <w:numFmt w:val="bullet"/>
+      <w:lvlText w:val=""/>
+      <w:lvlJc w:val="left"/>
+      <w:pPr>
+        <w:tabs>
+          <w:tab w:val="num" w:pos="2880"/>
+        </w:tabs>
+        <w:ind w:left="2880" w:hanging="360"/>
+      </w:pPr>
+      <w:rPr>
+        <w:rFonts w:ascii="Wingdings" w:hAnsi="Wingdings" w:hint="default"/>
+        <w:sz w:val="20"/>
+      </w:rPr>
+    </w:lvl>
+    <w:lvl w:ilvl="4" w:tentative="1">
+      <w:start w:val="1"/>
+      <w:numFmt w:val="bullet"/>
+      <w:lvlText w:val=""/>
+      <w:lvlJc w:val="left"/>
+      <w:pPr>
+        <w:tabs>
+          <w:tab w:val="num" w:pos="3600"/>
+        </w:tabs>
+        <w:ind w:left="3600" w:hanging="360"/>
+      </w:pPr>
+      <w:rPr>
+        <w:rFonts w:ascii="Wingdings" w:hAnsi="Wingdings" w:hint="default"/>
+        <w:sz w:val="20"/>
+      </w:rPr>
+    </w:lvl>
+    <w:lvl w:ilvl="5" w:tentative="1">
+      <w:start w:val="1"/>
+      <w:numFmt w:val="bullet"/>
+      <w:lvlText w:val=""/>
+      <w:lvlJc w:val="left"/>
+      <w:pPr>
+        <w:tabs>
+          <w:tab w:val="num" w:pos="4320"/>
+        </w:tabs>
+        <w:ind w:left="4320" w:hanging="360"/>
+      </w:pPr>
+      <w:rPr>
+        <w:rFonts w:ascii="Wingdings" w:hAnsi="Wingdings" w:hint="default"/>
+        <w:sz w:val="20"/>
+      </w:rPr>
+    </w:lvl>
+    <w:lvl w:ilvl="6" w:tentative="1">
+      <w:start w:val="1"/>
+      <w:numFmt w:val="bullet"/>
+      <w:lvlText w:val=""/>
+      <w:lvlJc w:val="left"/>
+      <w:pPr>
+        <w:tabs>
+          <w:tab w:val="num" w:pos="5040"/>
+        </w:tabs>
+        <w:ind w:left="5040" w:hanging="360"/>
+      </w:pPr>
+      <w:rPr>
+        <w:rFonts w:ascii="Wingdings" w:hAnsi="Wingdings" w:hint="default"/>
+        <w:sz w:val="20"/>
+      </w:rPr>
+    </w:lvl>
+    <w:lvl w:ilvl="7" w:tentative="1">
+      <w:start w:val="1"/>
+      <w:numFmt w:val="bullet"/>
+      <w:lvlText w:val=""/>
+      <w:lvlJc w:val="left"/>
+      <w:pPr>
+        <w:tabs>
+          <w:tab w:val="num" w:pos="5760"/>
+        </w:tabs>
+        <w:ind w:left="5760" w:hanging="360"/>
+      </w:pPr>
+      <w:rPr>
+        <w:rFonts w:ascii="Wingdings" w:hAnsi="Wingdings" w:hint="default"/>
+        <w:sz w:val="20"/>
+      </w:rPr>
+    </w:lvl>
+    <w:lvl w:ilvl="8" w:tentative="1">
+      <w:start w:val="1"/>
+      <w:numFmt w:val="bullet"/>
+      <w:lvlText w:val=""/>
+      <w:lvlJc w:val="left"/>
+      <w:pPr>
+        <w:tabs>
+          <w:tab w:val="num" w:pos="6480"/>
+        </w:tabs>
+        <w:ind w:left="6480" w:hanging="360"/>
+      </w:pPr>
+      <w:rPr>
+        <w:rFonts w:ascii="Wingdings" w:hAnsi="Wingdings" w:hint="default"/>
+        <w:sz w:val="20"/>
+      </w:rPr>
+    </w:lvl>
+  </w:abstractNum>
+  <w:abstractNum w:abstractNumId="1" w15:restartNumberingAfterBreak="0">
+    <w:nsid w:val="23B33A45"/>
+    <w:multiLevelType w:val="multilevel"/>
+    <w:tmpl w:val="77627428"/>
+    <w:lvl w:ilvl="0">
+      <w:start w:val="1"/>
+      <w:numFmt w:val="bullet"/>
+      <w:lvlText w:val=""/>
+      <w:lvlJc w:val="left"/>
+      <w:pPr>
+        <w:tabs>
+          <w:tab w:val="num" w:pos="720"/>
+        </w:tabs>
+        <w:ind w:left="720" w:hanging="360"/>
+      </w:pPr>
+      <w:rPr>
+        <w:rFonts w:ascii="Symbol" w:hAnsi="Symbol" w:hint="default"/>
+        <w:sz w:val="20"/>
+      </w:rPr>
+    </w:lvl>
+    <w:lvl w:ilvl="1" w:tentative="1">
+      <w:start w:val="1"/>
+      <w:numFmt w:val="bullet"/>
+      <w:lvlText w:val="o"/>
+      <w:lvlJc w:val="left"/>
+      <w:pPr>
+        <w:tabs>
+          <w:tab w:val="num" w:pos="1440"/>
+        </w:tabs>
+        <w:ind w:left="1440" w:hanging="360"/>
+      </w:pPr>
+      <w:rPr>
+        <w:rFonts w:ascii="Courier New" w:hAnsi="Courier New" w:hint="default"/>
+        <w:sz w:val="20"/>
+      </w:rPr>
+    </w:lvl>
+    <w:lvl w:ilvl="2" w:tentative="1">
+      <w:start w:val="1"/>
+      <w:numFmt w:val="bullet"/>
+      <w:lvlText w:val=""/>
+      <w:lvlJc w:val="left"/>
+      <w:pPr>
+        <w:tabs>
+          <w:tab w:val="num" w:pos="2160"/>
+        </w:tabs>
+        <w:ind w:left="2160" w:hanging="360"/>
+      </w:pPr>
+      <w:rPr>
+        <w:rFonts w:ascii="Wingdings" w:hAnsi="Wingdings" w:hint="default"/>
+        <w:sz w:val="20"/>
+      </w:rPr>
+    </w:lvl>
+    <w:lvl w:ilvl="3" w:tentative="1">
+      <w:start w:val="1"/>
+      <w:numFmt w:val="bullet"/>
+      <w:lvlText w:val=""/>
+      <w:lvlJc w:val="left"/>
+      <w:pPr>
+        <w:tabs>
+          <w:tab w:val="num" w:pos="2880"/>
+        </w:tabs>
+        <w:ind w:left="2880" w:hanging="360"/>
+      </w:pPr>
+      <w:rPr>
+        <w:rFonts w:ascii="Wingdings" w:hAnsi="Wingdings" w:hint="default"/>
+        <w:sz w:val="20"/>
+      </w:rPr>
+    </w:lvl>
+    <w:lvl w:ilvl="4" w:tentative="1">
+      <w:start w:val="1"/>
+      <w:numFmt w:val="bullet"/>
+      <w:lvlText w:val=""/>
+      <w:lvlJc w:val="left"/>
+      <w:pPr>
+        <w:tabs>
+          <w:tab w:val="num" w:pos="3600"/>
+        </w:tabs>
+        <w:ind w:left="3600" w:hanging="360"/>
+      </w:pPr>
+      <w:rPr>
+        <w:rFonts w:ascii="Wingdings" w:hAnsi="Wingdings" w:hint="default"/>
+        <w:sz w:val="20"/>
+      </w:rPr>
+    </w:lvl>
+    <w:lvl w:ilvl="5" w:tentative="1">
+      <w:start w:val="1"/>
+      <w:numFmt w:val="bullet"/>
+      <w:lvlText w:val=""/>
+      <w:lvlJc w:val="left"/>
+      <w:pPr>
+        <w:tabs>
+          <w:tab w:val="num" w:pos="4320"/>
+        </w:tabs>
+        <w:ind w:left="4320" w:hanging="360"/>
+      </w:pPr>
+      <w:rPr>
+        <w:rFonts w:ascii="Wingdings" w:hAnsi="Wingdings" w:hint="default"/>
+        <w:sz w:val="20"/>
+      </w:rPr>
+    </w:lvl>
+    <w:lvl w:ilvl="6" w:tentative="1">
+      <w:start w:val="1"/>
+      <w:numFmt w:val="bullet"/>
+      <w:lvlText w:val=""/>
+      <w:lvlJc w:val="left"/>
+      <w:pPr>
+        <w:tabs>
+          <w:tab w:val="num" w:pos="5040"/>
+        </w:tabs>
+        <w:ind w:left="5040" w:hanging="360"/>
+      </w:pPr>
+      <w:rPr>
+        <w:rFonts w:ascii="Wingdings" w:hAnsi="Wingdings" w:hint="default"/>
+        <w:sz w:val="20"/>
+      </w:rPr>
+    </w:lvl>
+    <w:lvl w:ilvl="7" w:tentative="1">
+      <w:start w:val="1"/>
+      <w:numFmt w:val="bullet"/>
+      <w:lvlText w:val=""/>
+      <w:lvlJc w:val="left"/>
+      <w:pPr>
+        <w:tabs>
+          <w:tab w:val="num" w:pos="5760"/>
+        </w:tabs>
+        <w:ind w:left="5760" w:hanging="360"/>
+      </w:pPr>
+      <w:rPr>
+        <w:rFonts w:ascii="Wingdings" w:hAnsi="Wingdings" w:hint="default"/>
+        <w:sz w:val="20"/>
+      </w:rPr>
+    </w:lvl>
+    <w:lvl w:ilvl="8" w:tentative="1">
+      <w:start w:val="1"/>
+      <w:numFmt w:val="bullet"/>
+      <w:lvlText w:val=""/>
+      <w:lvlJc w:val="left"/>
+      <w:pPr>
+        <w:tabs>
+          <w:tab w:val="num" w:pos="6480"/>
+        </w:tabs>
+        <w:ind w:left="6480" w:hanging="360"/>
+      </w:pPr>
+      <w:rPr>
+        <w:rFonts w:ascii="Wingdings" w:hAnsi="Wingdings" w:hint="default"/>
+        <w:sz w:val="20"/>
+      </w:rPr>
+    </w:lvl>
+  </w:abstractNum>
+  <w:abstractNum w:abstractNumId="2" w15:restartNumberingAfterBreak="0">
+    <w:nsid w:val="31EB328F"/>
+    <w:multiLevelType w:val="multilevel"/>
+    <w:tmpl w:val="8F5EAE92"/>
+    <w:lvl w:ilvl="0">
+      <w:start w:val="1"/>
+      <w:numFmt w:val="bullet"/>
+      <w:lvlText w:val=""/>
+      <w:lvlJc w:val="left"/>
+      <w:pPr>
+        <w:tabs>
+          <w:tab w:val="num" w:pos="720"/>
+        </w:tabs>
+        <w:ind w:left="720" w:hanging="360"/>
+      </w:pPr>
+      <w:rPr>
+        <w:rFonts w:ascii="Symbol" w:hAnsi="Symbol" w:hint="default"/>
+        <w:sz w:val="20"/>
+      </w:rPr>
+    </w:lvl>
+    <w:lvl w:ilvl="1">
+      <w:start w:val="1"/>
+      <w:numFmt w:val="bullet"/>
+      <w:lvlText w:val="o"/>
+      <w:lvlJc w:val="left"/>
+      <w:pPr>
+        <w:tabs>
+          <w:tab w:val="num" w:pos="1440"/>
+        </w:tabs>
+        <w:ind w:left="1440" w:hanging="360"/>
+      </w:pPr>
+      <w:rPr>
+        <w:rFonts w:ascii="Courier New" w:hAnsi="Courier New" w:hint="default"/>
+        <w:sz w:val="20"/>
+      </w:rPr>
+    </w:lvl>
+    <w:lvl w:ilvl="2" w:tentative="1">
+      <w:start w:val="1"/>
+      <w:numFmt w:val="bullet"/>
+      <w:lvlText w:val=""/>
+      <w:lvlJc w:val="left"/>
+      <w:pPr>
+        <w:tabs>
+          <w:tab w:val="num" w:pos="2160"/>
+        </w:tabs>
+        <w:ind w:left="2160" w:hanging="360"/>
+      </w:pPr>
+      <w:rPr>
+        <w:rFonts w:ascii="Wingdings" w:hAnsi="Wingdings" w:hint="default"/>
+        <w:sz w:val="20"/>
+      </w:rPr>
+    </w:lvl>
+    <w:lvl w:ilvl="3" w:tentative="1">
+      <w:start w:val="1"/>
+      <w:numFmt w:val="bullet"/>
+      <w:lvlText w:val=""/>
+      <w:lvlJc w:val="left"/>
+      <w:pPr>
+        <w:tabs>
+          <w:tab w:val="num" w:pos="2880"/>
+        </w:tabs>
+        <w:ind w:left="2880" w:hanging="360"/>
+      </w:pPr>
+      <w:rPr>
+        <w:rFonts w:ascii="Wingdings" w:hAnsi="Wingdings" w:hint="default"/>
+        <w:sz w:val="20"/>
+      </w:rPr>
+    </w:lvl>
+    <w:lvl w:ilvl="4" w:tentative="1">
+      <w:start w:val="1"/>
+      <w:numFmt w:val="bullet"/>
+      <w:lvlText w:val=""/>
+      <w:lvlJc w:val="left"/>
+      <w:pPr>
+        <w:tabs>
+          <w:tab w:val="num" w:pos="3600"/>
+        </w:tabs>
+        <w:ind w:left="3600" w:hanging="360"/>
+      </w:pPr>
+      <w:rPr>
+        <w:rFonts w:ascii="Wingdings" w:hAnsi="Wingdings" w:hint="default"/>
+        <w:sz w:val="20"/>
+      </w:rPr>
+    </w:lvl>
+    <w:lvl w:ilvl="5" w:tentative="1">
+      <w:start w:val="1"/>
+      <w:numFmt w:val="bullet"/>
+      <w:lvlText w:val=""/>
+      <w:lvlJc w:val="left"/>
+      <w:pPr>
+        <w:tabs>
+          <w:tab w:val="num" w:pos="4320"/>
+        </w:tabs>
+        <w:ind w:left="4320" w:hanging="360"/>
+      </w:pPr>
+      <w:rPr>
+        <w:rFonts w:ascii="Wingdings" w:hAnsi="Wingdings" w:hint="default"/>
+        <w:sz w:val="20"/>
+      </w:rPr>
+    </w:lvl>
+    <w:lvl w:ilvl="6" w:tentative="1">
+      <w:start w:val="1"/>
+      <w:numFmt w:val="bullet"/>
+      <w:lvlText w:val=""/>
+      <w:lvlJc w:val="left"/>
+      <w:pPr>
+        <w:tabs>
+          <w:tab w:val="num" w:pos="5040"/>
+        </w:tabs>
+        <w:ind w:left="5040" w:hanging="360"/>
+      </w:pPr>
+      <w:rPr>
+        <w:rFonts w:ascii="Wingdings" w:hAnsi="Wingdings" w:hint="default"/>
+        <w:sz w:val="20"/>
+      </w:rPr>
+    </w:lvl>
+    <w:lvl w:ilvl="7" w:tentative="1">
+      <w:start w:val="1"/>
+      <w:numFmt w:val="bullet"/>
+      <w:lvlText w:val=""/>
+      <w:lvlJc w:val="left"/>
+      <w:pPr>
+        <w:tabs>
+          <w:tab w:val="num" w:pos="5760"/>
+        </w:tabs>
+        <w:ind w:left="5760" w:hanging="360"/>
+      </w:pPr>
+      <w:rPr>
+        <w:rFonts w:ascii="Wingdings" w:hAnsi="Wingdings" w:hint="default"/>
+        <w:sz w:val="20"/>
+      </w:rPr>
+    </w:lvl>
+    <w:lvl w:ilvl="8" w:tentative="1">
+      <w:start w:val="1"/>
+      <w:numFmt w:val="bullet"/>
+      <w:lvlText w:val=""/>
+      <w:lvlJc w:val="left"/>
+      <w:pPr>
+        <w:tabs>
+          <w:tab w:val="num" w:pos="6480"/>
+        </w:tabs>
+        <w:ind w:left="6480" w:hanging="360"/>
+      </w:pPr>
+      <w:rPr>
+        <w:rFonts w:ascii="Wingdings" w:hAnsi="Wingdings" w:hint="default"/>
+        <w:sz w:val="20"/>
+      </w:rPr>
+    </w:lvl>
+  </w:abstractNum>
+  <w:abstractNum w:abstractNumId="3" w15:restartNumberingAfterBreak="0">
     <w:nsid w:val="350F506D"/>
     <w:multiLevelType w:val="multilevel"/>
     <w:tmpl w:val="8AB6072E"/>
@@ -803,8 +2340,625 @@
       </w:rPr>
     </w:lvl>
   </w:abstractNum>
+  <w:abstractNum w:abstractNumId="4" w15:restartNumberingAfterBreak="0">
+    <w:nsid w:val="372121EB"/>
+    <w:multiLevelType w:val="multilevel"/>
+    <w:tmpl w:val="B5BA2D4A"/>
+    <w:lvl w:ilvl="0">
+      <w:start w:val="1"/>
+      <w:numFmt w:val="bullet"/>
+      <w:lvlText w:val=""/>
+      <w:lvlJc w:val="left"/>
+      <w:pPr>
+        <w:tabs>
+          <w:tab w:val="num" w:pos="720"/>
+        </w:tabs>
+        <w:ind w:left="720" w:hanging="360"/>
+      </w:pPr>
+      <w:rPr>
+        <w:rFonts w:ascii="Symbol" w:hAnsi="Symbol" w:hint="default"/>
+        <w:sz w:val="20"/>
+      </w:rPr>
+    </w:lvl>
+    <w:lvl w:ilvl="1" w:tentative="1">
+      <w:start w:val="1"/>
+      <w:numFmt w:val="bullet"/>
+      <w:lvlText w:val="o"/>
+      <w:lvlJc w:val="left"/>
+      <w:pPr>
+        <w:tabs>
+          <w:tab w:val="num" w:pos="1440"/>
+        </w:tabs>
+        <w:ind w:left="1440" w:hanging="360"/>
+      </w:pPr>
+      <w:rPr>
+        <w:rFonts w:ascii="Courier New" w:hAnsi="Courier New" w:hint="default"/>
+        <w:sz w:val="20"/>
+      </w:rPr>
+    </w:lvl>
+    <w:lvl w:ilvl="2" w:tentative="1">
+      <w:start w:val="1"/>
+      <w:numFmt w:val="bullet"/>
+      <w:lvlText w:val=""/>
+      <w:lvlJc w:val="left"/>
+      <w:pPr>
+        <w:tabs>
+          <w:tab w:val="num" w:pos="2160"/>
+        </w:tabs>
+        <w:ind w:left="2160" w:hanging="360"/>
+      </w:pPr>
+      <w:rPr>
+        <w:rFonts w:ascii="Wingdings" w:hAnsi="Wingdings" w:hint="default"/>
+        <w:sz w:val="20"/>
+      </w:rPr>
+    </w:lvl>
+    <w:lvl w:ilvl="3" w:tentative="1">
+      <w:start w:val="1"/>
+      <w:numFmt w:val="bullet"/>
+      <w:lvlText w:val=""/>
+      <w:lvlJc w:val="left"/>
+      <w:pPr>
+        <w:tabs>
+          <w:tab w:val="num" w:pos="2880"/>
+        </w:tabs>
+        <w:ind w:left="2880" w:hanging="360"/>
+      </w:pPr>
+      <w:rPr>
+        <w:rFonts w:ascii="Wingdings" w:hAnsi="Wingdings" w:hint="default"/>
+        <w:sz w:val="20"/>
+      </w:rPr>
+    </w:lvl>
+    <w:lvl w:ilvl="4" w:tentative="1">
+      <w:start w:val="1"/>
+      <w:numFmt w:val="bullet"/>
+      <w:lvlText w:val=""/>
+      <w:lvlJc w:val="left"/>
+      <w:pPr>
+        <w:tabs>
+          <w:tab w:val="num" w:pos="3600"/>
+        </w:tabs>
+        <w:ind w:left="3600" w:hanging="360"/>
+      </w:pPr>
+      <w:rPr>
+        <w:rFonts w:ascii="Wingdings" w:hAnsi="Wingdings" w:hint="default"/>
+        <w:sz w:val="20"/>
+      </w:rPr>
+    </w:lvl>
+    <w:lvl w:ilvl="5" w:tentative="1">
+      <w:start w:val="1"/>
+      <w:numFmt w:val="bullet"/>
+      <w:lvlText w:val=""/>
+      <w:lvlJc w:val="left"/>
+      <w:pPr>
+        <w:tabs>
+          <w:tab w:val="num" w:pos="4320"/>
+        </w:tabs>
+        <w:ind w:left="4320" w:hanging="360"/>
+      </w:pPr>
+      <w:rPr>
+        <w:rFonts w:ascii="Wingdings" w:hAnsi="Wingdings" w:hint="default"/>
+        <w:sz w:val="20"/>
+      </w:rPr>
+    </w:lvl>
+    <w:lvl w:ilvl="6" w:tentative="1">
+      <w:start w:val="1"/>
+      <w:numFmt w:val="bullet"/>
+      <w:lvlText w:val=""/>
+      <w:lvlJc w:val="left"/>
+      <w:pPr>
+        <w:tabs>
+          <w:tab w:val="num" w:pos="5040"/>
+        </w:tabs>
+        <w:ind w:left="5040" w:hanging="360"/>
+      </w:pPr>
+      <w:rPr>
+        <w:rFonts w:ascii="Wingdings" w:hAnsi="Wingdings" w:hint="default"/>
+        <w:sz w:val="20"/>
+      </w:rPr>
+    </w:lvl>
+    <w:lvl w:ilvl="7" w:tentative="1">
+      <w:start w:val="1"/>
+      <w:numFmt w:val="bullet"/>
+      <w:lvlText w:val=""/>
+      <w:lvlJc w:val="left"/>
+      <w:pPr>
+        <w:tabs>
+          <w:tab w:val="num" w:pos="5760"/>
+        </w:tabs>
+        <w:ind w:left="5760" w:hanging="360"/>
+      </w:pPr>
+      <w:rPr>
+        <w:rFonts w:ascii="Wingdings" w:hAnsi="Wingdings" w:hint="default"/>
+        <w:sz w:val="20"/>
+      </w:rPr>
+    </w:lvl>
+    <w:lvl w:ilvl="8" w:tentative="1">
+      <w:start w:val="1"/>
+      <w:numFmt w:val="bullet"/>
+      <w:lvlText w:val=""/>
+      <w:lvlJc w:val="left"/>
+      <w:pPr>
+        <w:tabs>
+          <w:tab w:val="num" w:pos="6480"/>
+        </w:tabs>
+        <w:ind w:left="6480" w:hanging="360"/>
+      </w:pPr>
+      <w:rPr>
+        <w:rFonts w:ascii="Wingdings" w:hAnsi="Wingdings" w:hint="default"/>
+        <w:sz w:val="20"/>
+      </w:rPr>
+    </w:lvl>
+  </w:abstractNum>
+  <w:abstractNum w:abstractNumId="5" w15:restartNumberingAfterBreak="0">
+    <w:nsid w:val="4DDD4EA9"/>
+    <w:multiLevelType w:val="multilevel"/>
+    <w:tmpl w:val="01068A08"/>
+    <w:lvl w:ilvl="0">
+      <w:start w:val="1"/>
+      <w:numFmt w:val="bullet"/>
+      <w:lvlText w:val=""/>
+      <w:lvlJc w:val="left"/>
+      <w:pPr>
+        <w:tabs>
+          <w:tab w:val="num" w:pos="720"/>
+        </w:tabs>
+        <w:ind w:left="720" w:hanging="360"/>
+      </w:pPr>
+      <w:rPr>
+        <w:rFonts w:ascii="Symbol" w:hAnsi="Symbol" w:hint="default"/>
+        <w:sz w:val="20"/>
+      </w:rPr>
+    </w:lvl>
+    <w:lvl w:ilvl="1" w:tentative="1">
+      <w:start w:val="1"/>
+      <w:numFmt w:val="bullet"/>
+      <w:lvlText w:val="o"/>
+      <w:lvlJc w:val="left"/>
+      <w:pPr>
+        <w:tabs>
+          <w:tab w:val="num" w:pos="1440"/>
+        </w:tabs>
+        <w:ind w:left="1440" w:hanging="360"/>
+      </w:pPr>
+      <w:rPr>
+        <w:rFonts w:ascii="Courier New" w:hAnsi="Courier New" w:hint="default"/>
+        <w:sz w:val="20"/>
+      </w:rPr>
+    </w:lvl>
+    <w:lvl w:ilvl="2" w:tentative="1">
+      <w:start w:val="1"/>
+      <w:numFmt w:val="bullet"/>
+      <w:lvlText w:val=""/>
+      <w:lvlJc w:val="left"/>
+      <w:pPr>
+        <w:tabs>
+          <w:tab w:val="num" w:pos="2160"/>
+        </w:tabs>
+        <w:ind w:left="2160" w:hanging="360"/>
+      </w:pPr>
+      <w:rPr>
+        <w:rFonts w:ascii="Wingdings" w:hAnsi="Wingdings" w:hint="default"/>
+        <w:sz w:val="20"/>
+      </w:rPr>
+    </w:lvl>
+    <w:lvl w:ilvl="3" w:tentative="1">
+      <w:start w:val="1"/>
+      <w:numFmt w:val="bullet"/>
+      <w:lvlText w:val=""/>
+      <w:lvlJc w:val="left"/>
+      <w:pPr>
+        <w:tabs>
+          <w:tab w:val="num" w:pos="2880"/>
+        </w:tabs>
+        <w:ind w:left="2880" w:hanging="360"/>
+      </w:pPr>
+      <w:rPr>
+        <w:rFonts w:ascii="Wingdings" w:hAnsi="Wingdings" w:hint="default"/>
+        <w:sz w:val="20"/>
+      </w:rPr>
+    </w:lvl>
+    <w:lvl w:ilvl="4" w:tentative="1">
+      <w:start w:val="1"/>
+      <w:numFmt w:val="bullet"/>
+      <w:lvlText w:val=""/>
+      <w:lvlJc w:val="left"/>
+      <w:pPr>
+        <w:tabs>
+          <w:tab w:val="num" w:pos="3600"/>
+        </w:tabs>
+        <w:ind w:left="3600" w:hanging="360"/>
+      </w:pPr>
+      <w:rPr>
+        <w:rFonts w:ascii="Wingdings" w:hAnsi="Wingdings" w:hint="default"/>
+        <w:sz w:val="20"/>
+      </w:rPr>
+    </w:lvl>
+    <w:lvl w:ilvl="5" w:tentative="1">
+      <w:start w:val="1"/>
+      <w:numFmt w:val="bullet"/>
+      <w:lvlText w:val=""/>
+      <w:lvlJc w:val="left"/>
+      <w:pPr>
+        <w:tabs>
+          <w:tab w:val="num" w:pos="4320"/>
+        </w:tabs>
+        <w:ind w:left="4320" w:hanging="360"/>
+      </w:pPr>
+      <w:rPr>
+        <w:rFonts w:ascii="Wingdings" w:hAnsi="Wingdings" w:hint="default"/>
+        <w:sz w:val="20"/>
+      </w:rPr>
+    </w:lvl>
+    <w:lvl w:ilvl="6" w:tentative="1">
+      <w:start w:val="1"/>
+      <w:numFmt w:val="bullet"/>
+      <w:lvlText w:val=""/>
+      <w:lvlJc w:val="left"/>
+      <w:pPr>
+        <w:tabs>
+          <w:tab w:val="num" w:pos="5040"/>
+        </w:tabs>
+        <w:ind w:left="5040" w:hanging="360"/>
+      </w:pPr>
+      <w:rPr>
+        <w:rFonts w:ascii="Wingdings" w:hAnsi="Wingdings" w:hint="default"/>
+        <w:sz w:val="20"/>
+      </w:rPr>
+    </w:lvl>
+    <w:lvl w:ilvl="7" w:tentative="1">
+      <w:start w:val="1"/>
+      <w:numFmt w:val="bullet"/>
+      <w:lvlText w:val=""/>
+      <w:lvlJc w:val="left"/>
+      <w:pPr>
+        <w:tabs>
+          <w:tab w:val="num" w:pos="5760"/>
+        </w:tabs>
+        <w:ind w:left="5760" w:hanging="360"/>
+      </w:pPr>
+      <w:rPr>
+        <w:rFonts w:ascii="Wingdings" w:hAnsi="Wingdings" w:hint="default"/>
+        <w:sz w:val="20"/>
+      </w:rPr>
+    </w:lvl>
+    <w:lvl w:ilvl="8" w:tentative="1">
+      <w:start w:val="1"/>
+      <w:numFmt w:val="bullet"/>
+      <w:lvlText w:val=""/>
+      <w:lvlJc w:val="left"/>
+      <w:pPr>
+        <w:tabs>
+          <w:tab w:val="num" w:pos="6480"/>
+        </w:tabs>
+        <w:ind w:left="6480" w:hanging="360"/>
+      </w:pPr>
+      <w:rPr>
+        <w:rFonts w:ascii="Wingdings" w:hAnsi="Wingdings" w:hint="default"/>
+        <w:sz w:val="20"/>
+      </w:rPr>
+    </w:lvl>
+  </w:abstractNum>
+  <w:abstractNum w:abstractNumId="6" w15:restartNumberingAfterBreak="0">
+    <w:nsid w:val="57FB780D"/>
+    <w:multiLevelType w:val="multilevel"/>
+    <w:tmpl w:val="C60C61B6"/>
+    <w:lvl w:ilvl="0">
+      <w:start w:val="1"/>
+      <w:numFmt w:val="bullet"/>
+      <w:lvlText w:val=""/>
+      <w:lvlJc w:val="left"/>
+      <w:pPr>
+        <w:tabs>
+          <w:tab w:val="num" w:pos="720"/>
+        </w:tabs>
+        <w:ind w:left="720" w:hanging="360"/>
+      </w:pPr>
+      <w:rPr>
+        <w:rFonts w:ascii="Symbol" w:hAnsi="Symbol" w:hint="default"/>
+        <w:sz w:val="20"/>
+      </w:rPr>
+    </w:lvl>
+    <w:lvl w:ilvl="1" w:tentative="1">
+      <w:start w:val="1"/>
+      <w:numFmt w:val="bullet"/>
+      <w:lvlText w:val="o"/>
+      <w:lvlJc w:val="left"/>
+      <w:pPr>
+        <w:tabs>
+          <w:tab w:val="num" w:pos="1440"/>
+        </w:tabs>
+        <w:ind w:left="1440" w:hanging="360"/>
+      </w:pPr>
+      <w:rPr>
+        <w:rFonts w:ascii="Courier New" w:hAnsi="Courier New" w:hint="default"/>
+        <w:sz w:val="20"/>
+      </w:rPr>
+    </w:lvl>
+    <w:lvl w:ilvl="2" w:tentative="1">
+      <w:start w:val="1"/>
+      <w:numFmt w:val="bullet"/>
+      <w:lvlText w:val=""/>
+      <w:lvlJc w:val="left"/>
+      <w:pPr>
+        <w:tabs>
+          <w:tab w:val="num" w:pos="2160"/>
+        </w:tabs>
+        <w:ind w:left="2160" w:hanging="360"/>
+      </w:pPr>
+      <w:rPr>
+        <w:rFonts w:ascii="Wingdings" w:hAnsi="Wingdings" w:hint="default"/>
+        <w:sz w:val="20"/>
+      </w:rPr>
+    </w:lvl>
+    <w:lvl w:ilvl="3" w:tentative="1">
+      <w:start w:val="1"/>
+      <w:numFmt w:val="bullet"/>
+      <w:lvlText w:val=""/>
+      <w:lvlJc w:val="left"/>
+      <w:pPr>
+        <w:tabs>
+          <w:tab w:val="num" w:pos="2880"/>
+        </w:tabs>
+        <w:ind w:left="2880" w:hanging="360"/>
+      </w:pPr>
+      <w:rPr>
+        <w:rFonts w:ascii="Wingdings" w:hAnsi="Wingdings" w:hint="default"/>
+        <w:sz w:val="20"/>
+      </w:rPr>
+    </w:lvl>
+    <w:lvl w:ilvl="4" w:tentative="1">
+      <w:start w:val="1"/>
+      <w:numFmt w:val="bullet"/>
+      <w:lvlText w:val=""/>
+      <w:lvlJc w:val="left"/>
+      <w:pPr>
+        <w:tabs>
+          <w:tab w:val="num" w:pos="3600"/>
+        </w:tabs>
+        <w:ind w:left="3600" w:hanging="360"/>
+      </w:pPr>
+      <w:rPr>
+        <w:rFonts w:ascii="Wingdings" w:hAnsi="Wingdings" w:hint="default"/>
+        <w:sz w:val="20"/>
+      </w:rPr>
+    </w:lvl>
+    <w:lvl w:ilvl="5" w:tentative="1">
+      <w:start w:val="1"/>
+      <w:numFmt w:val="bullet"/>
+      <w:lvlText w:val=""/>
+      <w:lvlJc w:val="left"/>
+      <w:pPr>
+        <w:tabs>
+          <w:tab w:val="num" w:pos="4320"/>
+        </w:tabs>
+        <w:ind w:left="4320" w:hanging="360"/>
+      </w:pPr>
+      <w:rPr>
+        <w:rFonts w:ascii="Wingdings" w:hAnsi="Wingdings" w:hint="default"/>
+        <w:sz w:val="20"/>
+      </w:rPr>
+    </w:lvl>
+    <w:lvl w:ilvl="6" w:tentative="1">
+      <w:start w:val="1"/>
+      <w:numFmt w:val="bullet"/>
+      <w:lvlText w:val=""/>
+      <w:lvlJc w:val="left"/>
+      <w:pPr>
+        <w:tabs>
+          <w:tab w:val="num" w:pos="5040"/>
+        </w:tabs>
+        <w:ind w:left="5040" w:hanging="360"/>
+      </w:pPr>
+      <w:rPr>
+        <w:rFonts w:ascii="Wingdings" w:hAnsi="Wingdings" w:hint="default"/>
+        <w:sz w:val="20"/>
+      </w:rPr>
+    </w:lvl>
+    <w:lvl w:ilvl="7" w:tentative="1">
+      <w:start w:val="1"/>
+      <w:numFmt w:val="bullet"/>
+      <w:lvlText w:val=""/>
+      <w:lvlJc w:val="left"/>
+      <w:pPr>
+        <w:tabs>
+          <w:tab w:val="num" w:pos="5760"/>
+        </w:tabs>
+        <w:ind w:left="5760" w:hanging="360"/>
+      </w:pPr>
+      <w:rPr>
+        <w:rFonts w:ascii="Wingdings" w:hAnsi="Wingdings" w:hint="default"/>
+        <w:sz w:val="20"/>
+      </w:rPr>
+    </w:lvl>
+    <w:lvl w:ilvl="8" w:tentative="1">
+      <w:start w:val="1"/>
+      <w:numFmt w:val="bullet"/>
+      <w:lvlText w:val=""/>
+      <w:lvlJc w:val="left"/>
+      <w:pPr>
+        <w:tabs>
+          <w:tab w:val="num" w:pos="6480"/>
+        </w:tabs>
+        <w:ind w:left="6480" w:hanging="360"/>
+      </w:pPr>
+      <w:rPr>
+        <w:rFonts w:ascii="Wingdings" w:hAnsi="Wingdings" w:hint="default"/>
+        <w:sz w:val="20"/>
+      </w:rPr>
+    </w:lvl>
+  </w:abstractNum>
+  <w:abstractNum w:abstractNumId="7" w15:restartNumberingAfterBreak="0">
+    <w:nsid w:val="6A1F7931"/>
+    <w:multiLevelType w:val="multilevel"/>
+    <w:tmpl w:val="43962DC8"/>
+    <w:lvl w:ilvl="0">
+      <w:start w:val="1"/>
+      <w:numFmt w:val="bullet"/>
+      <w:lvlText w:val=""/>
+      <w:lvlJc w:val="left"/>
+      <w:pPr>
+        <w:tabs>
+          <w:tab w:val="num" w:pos="720"/>
+        </w:tabs>
+        <w:ind w:left="720" w:hanging="360"/>
+      </w:pPr>
+      <w:rPr>
+        <w:rFonts w:ascii="Symbol" w:hAnsi="Symbol" w:hint="default"/>
+        <w:sz w:val="20"/>
+      </w:rPr>
+    </w:lvl>
+    <w:lvl w:ilvl="1" w:tentative="1">
+      <w:start w:val="1"/>
+      <w:numFmt w:val="bullet"/>
+      <w:lvlText w:val="o"/>
+      <w:lvlJc w:val="left"/>
+      <w:pPr>
+        <w:tabs>
+          <w:tab w:val="num" w:pos="1440"/>
+        </w:tabs>
+        <w:ind w:left="1440" w:hanging="360"/>
+      </w:pPr>
+      <w:rPr>
+        <w:rFonts w:ascii="Courier New" w:hAnsi="Courier New" w:hint="default"/>
+        <w:sz w:val="20"/>
+      </w:rPr>
+    </w:lvl>
+    <w:lvl w:ilvl="2" w:tentative="1">
+      <w:start w:val="1"/>
+      <w:numFmt w:val="bullet"/>
+      <w:lvlText w:val=""/>
+      <w:lvlJc w:val="left"/>
+      <w:pPr>
+        <w:tabs>
+          <w:tab w:val="num" w:pos="2160"/>
+        </w:tabs>
+        <w:ind w:left="2160" w:hanging="360"/>
+      </w:pPr>
+      <w:rPr>
+        <w:rFonts w:ascii="Wingdings" w:hAnsi="Wingdings" w:hint="default"/>
+        <w:sz w:val="20"/>
+      </w:rPr>
+    </w:lvl>
+    <w:lvl w:ilvl="3" w:tentative="1">
+      <w:start w:val="1"/>
+      <w:numFmt w:val="bullet"/>
+      <w:lvlText w:val=""/>
+      <w:lvlJc w:val="left"/>
+      <w:pPr>
+        <w:tabs>
+          <w:tab w:val="num" w:pos="2880"/>
+        </w:tabs>
+        <w:ind w:left="2880" w:hanging="360"/>
+      </w:pPr>
+      <w:rPr>
+        <w:rFonts w:ascii="Wingdings" w:hAnsi="Wingdings" w:hint="default"/>
+        <w:sz w:val="20"/>
+      </w:rPr>
+    </w:lvl>
+    <w:lvl w:ilvl="4" w:tentative="1">
+      <w:start w:val="1"/>
+      <w:numFmt w:val="bullet"/>
+      <w:lvlText w:val=""/>
+      <w:lvlJc w:val="left"/>
+      <w:pPr>
+        <w:tabs>
+          <w:tab w:val="num" w:pos="3600"/>
+        </w:tabs>
+        <w:ind w:left="3600" w:hanging="360"/>
+      </w:pPr>
+      <w:rPr>
+        <w:rFonts w:ascii="Wingdings" w:hAnsi="Wingdings" w:hint="default"/>
+        <w:sz w:val="20"/>
+      </w:rPr>
+    </w:lvl>
+    <w:lvl w:ilvl="5" w:tentative="1">
+      <w:start w:val="1"/>
+      <w:numFmt w:val="bullet"/>
+      <w:lvlText w:val=""/>
+      <w:lvlJc w:val="left"/>
+      <w:pPr>
+        <w:tabs>
+          <w:tab w:val="num" w:pos="4320"/>
+        </w:tabs>
+        <w:ind w:left="4320" w:hanging="360"/>
+      </w:pPr>
+      <w:rPr>
+        <w:rFonts w:ascii="Wingdings" w:hAnsi="Wingdings" w:hint="default"/>
+        <w:sz w:val="20"/>
+      </w:rPr>
+    </w:lvl>
+    <w:lvl w:ilvl="6" w:tentative="1">
+      <w:start w:val="1"/>
+      <w:numFmt w:val="bullet"/>
+      <w:lvlText w:val=""/>
+      <w:lvlJc w:val="left"/>
+      <w:pPr>
+        <w:tabs>
+          <w:tab w:val="num" w:pos="5040"/>
+        </w:tabs>
+        <w:ind w:left="5040" w:hanging="360"/>
+      </w:pPr>
+      <w:rPr>
+        <w:rFonts w:ascii="Wingdings" w:hAnsi="Wingdings" w:hint="default"/>
+        <w:sz w:val="20"/>
+      </w:rPr>
+    </w:lvl>
+    <w:lvl w:ilvl="7" w:tentative="1">
+      <w:start w:val="1"/>
+      <w:numFmt w:val="bullet"/>
+      <w:lvlText w:val=""/>
+      <w:lvlJc w:val="left"/>
+      <w:pPr>
+        <w:tabs>
+          <w:tab w:val="num" w:pos="5760"/>
+        </w:tabs>
+        <w:ind w:left="5760" w:hanging="360"/>
+      </w:pPr>
+      <w:rPr>
+        <w:rFonts w:ascii="Wingdings" w:hAnsi="Wingdings" w:hint="default"/>
+        <w:sz w:val="20"/>
+      </w:rPr>
+    </w:lvl>
+    <w:lvl w:ilvl="8" w:tentative="1">
+      <w:start w:val="1"/>
+      <w:numFmt w:val="bullet"/>
+      <w:lvlText w:val=""/>
+      <w:lvlJc w:val="left"/>
+      <w:pPr>
+        <w:tabs>
+          <w:tab w:val="num" w:pos="6480"/>
+        </w:tabs>
+        <w:ind w:left="6480" w:hanging="360"/>
+      </w:pPr>
+      <w:rPr>
+        <w:rFonts w:ascii="Wingdings" w:hAnsi="Wingdings" w:hint="default"/>
+        <w:sz w:val="20"/>
+      </w:rPr>
+    </w:lvl>
+  </w:abstractNum>
   <w:num w:numId="1">
+    <w:abstractNumId w:val="3"/>
+  </w:num>
+  <w:num w:numId="2">
+    <w:abstractNumId w:val="7"/>
+  </w:num>
+  <w:num w:numId="3">
+    <w:abstractNumId w:val="5"/>
+  </w:num>
+  <w:num w:numId="4">
+    <w:abstractNumId w:val="6"/>
+  </w:num>
+  <w:num w:numId="5">
+    <w:abstractNumId w:val="4"/>
+  </w:num>
+  <w:num w:numId="6">
     <w:abstractNumId w:val="0"/>
+  </w:num>
+  <w:num w:numId="7">
+    <w:abstractNumId w:val="2"/>
+  </w:num>
+  <w:num w:numId="8">
+    <w:abstractNumId w:val="1"/>
   </w:num>
 </w:numbering>
 </file>
@@ -1328,6 +3482,17 @@
     <w:basedOn w:val="Bekezdsalapbettpusa"/>
     <w:rsid w:val="00A623AF"/>
   </w:style>
+  <w:style w:type="character" w:styleId="Kiemels2">
+    <w:name w:val="Strong"/>
+    <w:basedOn w:val="Bekezdsalapbettpusa"/>
+    <w:uiPriority w:val="22"/>
+    <w:qFormat/>
+    <w:rsid w:val="00CB20BB"/>
+    <w:rPr>
+      <w:b/>
+      <w:bCs/>
+    </w:rPr>
+  </w:style>
 </w:styles>
 </file>
 

</xml_diff>